<commit_message>
move messy outputs to archive
</commit_message>
<xml_diff>
--- a/supplementary_materials/supplementary tables/Supplementary Tables.docx
+++ b/supplementary_materials/supplementary tables/Supplementary Tables.docx
@@ -5,11 +5,15 @@
     <w:p>
       <w:pPr>
         <w:rPr>
+          <w:b/>
+          <w:bCs/>
           <w:lang w:val="en-GB"/>
         </w:rPr>
       </w:pPr>
       <w:r>
         <w:rPr>
+          <w:b/>
+          <w:bCs/>
           <w:lang w:val="en-GB"/>
         </w:rPr>
         <w:t>Supplementary Materials</w:t>
@@ -29,10 +33,7 @@
         <w:ind w:left="60" w:right="60"/>
       </w:pPr>
       <w:r>
-        <w:t xml:space="preserve">Table S1 </w:t>
-      </w:r>
-      <w:r>
-        <w:t>Overarching domain</w:t>
+        <w:t>Table S1 Overarching Domain</w:t>
       </w:r>
     </w:p>
     <w:tbl>
@@ -183,16 +184,7 @@
                 <w:sz w:val="20"/>
                 <w:szCs w:val="20"/>
               </w:rPr>
-              <w:t>P</w:t>
-            </w:r>
-            <w:r>
-              <w:rPr>
-                <w:rFonts w:ascii="Arial" w:eastAsia="Arial" w:hAnsi="Arial" w:cs="Arial"/>
-                <w:color w:val="000000"/>
-                <w:sz w:val="20"/>
-                <w:szCs w:val="20"/>
-              </w:rPr>
-              <w:t>ercent</w:t>
+              <w:t>Percent</w:t>
             </w:r>
           </w:p>
         </w:tc>
@@ -235,17 +227,15 @@
                 <w:szCs w:val="20"/>
               </w:rPr>
             </w:pPr>
-            <w:proofErr w:type="spellStart"/>
-            <w:r>
-              <w:rPr>
-                <w:rFonts w:ascii="Arial" w:eastAsia="Arial" w:hAnsi="Arial" w:cs="Arial"/>
-                <w:color w:val="000000"/>
-                <w:sz w:val="20"/>
-                <w:szCs w:val="20"/>
-              </w:rPr>
-              <w:t>psychological_condition</w:t>
-            </w:r>
-            <w:proofErr w:type="spellEnd"/>
+            <w:r>
+              <w:rPr>
+                <w:rFonts w:ascii="Arial" w:eastAsia="Arial" w:hAnsi="Arial" w:cs="Arial"/>
+                <w:color w:val="000000"/>
+                <w:sz w:val="20"/>
+                <w:szCs w:val="20"/>
+              </w:rPr>
+              <w:t>Psychological condition</w:t>
+            </w:r>
           </w:p>
         </w:tc>
         <w:tc>
@@ -377,17 +367,15 @@
                 <w:szCs w:val="20"/>
               </w:rPr>
             </w:pPr>
-            <w:proofErr w:type="spellStart"/>
-            <w:r>
-              <w:rPr>
-                <w:rFonts w:ascii="Arial" w:eastAsia="Arial" w:hAnsi="Arial" w:cs="Arial"/>
-                <w:color w:val="000000"/>
-                <w:sz w:val="20"/>
-                <w:szCs w:val="20"/>
-              </w:rPr>
-              <w:t>transdiagnostic_feature</w:t>
-            </w:r>
-            <w:proofErr w:type="spellEnd"/>
+            <w:r>
+              <w:rPr>
+                <w:rFonts w:ascii="Arial" w:eastAsia="Arial" w:hAnsi="Arial" w:cs="Arial"/>
+                <w:color w:val="000000"/>
+                <w:sz w:val="20"/>
+                <w:szCs w:val="20"/>
+              </w:rPr>
+              <w:t>Transdiagnostic feature</w:t>
+            </w:r>
           </w:p>
         </w:tc>
         <w:tc>
@@ -526,7 +514,7 @@
                 <w:sz w:val="20"/>
                 <w:szCs w:val="20"/>
               </w:rPr>
-              <w:t>other</w:t>
+              <w:t>Other</w:t>
             </w:r>
           </w:p>
         </w:tc>
@@ -659,17 +647,15 @@
                 <w:szCs w:val="20"/>
               </w:rPr>
             </w:pPr>
-            <w:proofErr w:type="spellStart"/>
-            <w:r>
-              <w:rPr>
-                <w:rFonts w:ascii="Arial" w:eastAsia="Arial" w:hAnsi="Arial" w:cs="Arial"/>
-                <w:color w:val="000000"/>
-                <w:sz w:val="20"/>
-                <w:szCs w:val="20"/>
-              </w:rPr>
-              <w:t>medical_condition</w:t>
-            </w:r>
-            <w:proofErr w:type="spellEnd"/>
+            <w:r>
+              <w:rPr>
+                <w:rFonts w:ascii="Arial" w:eastAsia="Arial" w:hAnsi="Arial" w:cs="Arial"/>
+                <w:color w:val="000000"/>
+                <w:sz w:val="20"/>
+                <w:szCs w:val="20"/>
+              </w:rPr>
+              <w:t>Medical condition</w:t>
+            </w:r>
           </w:p>
         </w:tc>
         <w:tc>
@@ -785,10 +771,7 @@
         <w:ind w:left="60" w:right="60"/>
       </w:pPr>
       <w:r>
-        <w:t xml:space="preserve">Table S2 </w:t>
-      </w:r>
-      <w:r>
-        <w:t>Number of Databases Used</w:t>
+        <w:t>Table S2 Number of Databases Used</w:t>
       </w:r>
     </w:p>
     <w:tbl>
@@ -801,7 +784,7 @@
       <w:tblGrid>
         <w:gridCol w:w="1426"/>
         <w:gridCol w:w="1352"/>
-        <w:gridCol w:w="1144"/>
+        <w:gridCol w:w="1333"/>
       </w:tblGrid>
       <w:tr>
         <w:trPr>
@@ -887,22 +870,20 @@
                 <w:szCs w:val="20"/>
               </w:rPr>
             </w:pPr>
-            <w:proofErr w:type="spellStart"/>
-            <w:r>
-              <w:rPr>
-                <w:rFonts w:ascii="Arial" w:eastAsia="Arial" w:hAnsi="Arial" w:cs="Arial"/>
-                <w:color w:val="000000"/>
-                <w:sz w:val="20"/>
-                <w:szCs w:val="20"/>
-              </w:rPr>
-              <w:t>n_studies</w:t>
-            </w:r>
-            <w:proofErr w:type="spellEnd"/>
-          </w:p>
-        </w:tc>
-        <w:tc>
-          <w:tcPr>
-            <w:tcW w:w="1144" w:type="dxa"/>
+            <w:r>
+              <w:rPr>
+                <w:rFonts w:ascii="Arial" w:eastAsia="Arial" w:hAnsi="Arial" w:cs="Arial"/>
+                <w:color w:val="000000"/>
+                <w:sz w:val="20"/>
+                <w:szCs w:val="20"/>
+              </w:rPr>
+              <w:t>n studies</w:t>
+            </w:r>
+          </w:p>
+        </w:tc>
+        <w:tc>
+          <w:tcPr>
+            <w:tcW w:w="1333" w:type="dxa"/>
             <w:tcBorders>
               <w:top w:val="single" w:sz="12" w:space="0" w:color="666666"/>
               <w:left w:val="none" w:sz="0" w:space="0" w:color="000000"/>
@@ -941,16 +922,7 @@
                 <w:sz w:val="20"/>
                 <w:szCs w:val="20"/>
               </w:rPr>
-              <w:t>P</w:t>
-            </w:r>
-            <w:r>
-              <w:rPr>
-                <w:rFonts w:ascii="Arial" w:eastAsia="Arial" w:hAnsi="Arial" w:cs="Arial"/>
-                <w:color w:val="000000"/>
-                <w:sz w:val="20"/>
-                <w:szCs w:val="20"/>
-              </w:rPr>
-              <w:t>ercent</w:t>
+              <w:t>Percent</w:t>
             </w:r>
           </w:p>
         </w:tc>
@@ -1051,7 +1023,7 @@
         </w:tc>
         <w:tc>
           <w:tcPr>
-            <w:tcW w:w="1144" w:type="dxa"/>
+            <w:tcW w:w="1333" w:type="dxa"/>
             <w:tcBorders>
               <w:top w:val="single" w:sz="12" w:space="0" w:color="666666"/>
               <w:left w:val="none" w:sz="0" w:space="0" w:color="000000"/>
@@ -1191,7 +1163,7 @@
         </w:tc>
         <w:tc>
           <w:tcPr>
-            <w:tcW w:w="1144" w:type="dxa"/>
+            <w:tcW w:w="1333" w:type="dxa"/>
             <w:tcBorders>
               <w:top w:val="none" w:sz="0" w:space="0" w:color="000000"/>
               <w:left w:val="none" w:sz="0" w:space="0" w:color="000000"/>
@@ -1331,7 +1303,7 @@
         </w:tc>
         <w:tc>
           <w:tcPr>
-            <w:tcW w:w="1144" w:type="dxa"/>
+            <w:tcW w:w="1333" w:type="dxa"/>
             <w:tcBorders>
               <w:top w:val="none" w:sz="0" w:space="0" w:color="000000"/>
               <w:left w:val="none" w:sz="0" w:space="0" w:color="000000"/>
@@ -1471,7 +1443,7 @@
         </w:tc>
         <w:tc>
           <w:tcPr>
-            <w:tcW w:w="1144" w:type="dxa"/>
+            <w:tcW w:w="1333" w:type="dxa"/>
             <w:tcBorders>
               <w:top w:val="none" w:sz="0" w:space="0" w:color="000000"/>
               <w:left w:val="none" w:sz="0" w:space="0" w:color="000000"/>
@@ -1611,7 +1583,7 @@
         </w:tc>
         <w:tc>
           <w:tcPr>
-            <w:tcW w:w="1144" w:type="dxa"/>
+            <w:tcW w:w="1333" w:type="dxa"/>
             <w:tcBorders>
               <w:top w:val="none" w:sz="0" w:space="0" w:color="000000"/>
               <w:left w:val="none" w:sz="0" w:space="0" w:color="000000"/>
@@ -1751,7 +1723,7 @@
         </w:tc>
         <w:tc>
           <w:tcPr>
-            <w:tcW w:w="1144" w:type="dxa"/>
+            <w:tcW w:w="1333" w:type="dxa"/>
             <w:tcBorders>
               <w:top w:val="none" w:sz="0" w:space="0" w:color="000000"/>
               <w:left w:val="none" w:sz="0" w:space="0" w:color="000000"/>
@@ -1817,10 +1789,7 @@
         <w:ind w:left="60" w:right="60"/>
       </w:pPr>
       <w:r>
-        <w:t xml:space="preserve">Table S3 </w:t>
-      </w:r>
-      <w:r>
-        <w:t>Reported databases/search sources</w:t>
+        <w:t>Table S3 Reported Databases/Search Sources</w:t>
       </w:r>
     </w:p>
     <w:tbl>
@@ -1881,16 +1850,7 @@
                 <w:sz w:val="20"/>
                 <w:szCs w:val="20"/>
               </w:rPr>
-              <w:t>D</w:t>
-            </w:r>
-            <w:r>
-              <w:rPr>
-                <w:rFonts w:ascii="Arial" w:eastAsia="Arial" w:hAnsi="Arial" w:cs="Arial"/>
-                <w:color w:val="000000"/>
-                <w:sz w:val="20"/>
-                <w:szCs w:val="20"/>
-              </w:rPr>
-              <w:t>atabase</w:t>
+              <w:t>Database</w:t>
             </w:r>
           </w:p>
         </w:tc>
@@ -1980,16 +1940,7 @@
                 <w:sz w:val="20"/>
                 <w:szCs w:val="20"/>
               </w:rPr>
-              <w:t>P</w:t>
-            </w:r>
-            <w:r>
-              <w:rPr>
-                <w:rFonts w:ascii="Arial" w:eastAsia="Arial" w:hAnsi="Arial" w:cs="Arial"/>
-                <w:color w:val="000000"/>
-                <w:sz w:val="20"/>
-                <w:szCs w:val="20"/>
-              </w:rPr>
-              <w:t>ercent</w:t>
+              <w:t>Percent</w:t>
             </w:r>
           </w:p>
         </w:tc>
@@ -2032,17 +1983,15 @@
                 <w:szCs w:val="20"/>
               </w:rPr>
             </w:pPr>
-            <w:proofErr w:type="spellStart"/>
-            <w:r>
-              <w:rPr>
-                <w:rFonts w:ascii="Arial" w:eastAsia="Arial" w:hAnsi="Arial" w:cs="Arial"/>
-                <w:color w:val="000000"/>
-                <w:sz w:val="20"/>
-                <w:szCs w:val="20"/>
-              </w:rPr>
-              <w:t>psycinfo</w:t>
-            </w:r>
-            <w:proofErr w:type="spellEnd"/>
+            <w:r>
+              <w:rPr>
+                <w:rFonts w:ascii="Arial" w:eastAsia="Arial" w:hAnsi="Arial" w:cs="Arial"/>
+                <w:color w:val="000000"/>
+                <w:sz w:val="20"/>
+                <w:szCs w:val="20"/>
+              </w:rPr>
+              <w:t>psycINFO</w:t>
+            </w:r>
           </w:p>
         </w:tc>
         <w:tc>
@@ -2174,17 +2123,15 @@
                 <w:szCs w:val="20"/>
               </w:rPr>
             </w:pPr>
-            <w:proofErr w:type="spellStart"/>
-            <w:r>
-              <w:rPr>
-                <w:rFonts w:ascii="Arial" w:eastAsia="Arial" w:hAnsi="Arial" w:cs="Arial"/>
-                <w:color w:val="000000"/>
-                <w:sz w:val="20"/>
-                <w:szCs w:val="20"/>
-              </w:rPr>
-              <w:t>pubmed</w:t>
-            </w:r>
-            <w:proofErr w:type="spellEnd"/>
+            <w:r>
+              <w:rPr>
+                <w:rFonts w:ascii="Arial" w:eastAsia="Arial" w:hAnsi="Arial" w:cs="Arial"/>
+                <w:color w:val="000000"/>
+                <w:sz w:val="20"/>
+                <w:szCs w:val="20"/>
+              </w:rPr>
+              <w:t>PubMed</w:t>
+            </w:r>
           </w:p>
         </w:tc>
         <w:tc>
@@ -2323,7 +2270,7 @@
                 <w:sz w:val="20"/>
                 <w:szCs w:val="20"/>
               </w:rPr>
-              <w:t>indeterminable</w:t>
+              <w:t>Indeterminable</w:t>
             </w:r>
           </w:p>
         </w:tc>
@@ -2456,17 +2403,15 @@
                 <w:szCs w:val="20"/>
               </w:rPr>
             </w:pPr>
-            <w:proofErr w:type="spellStart"/>
-            <w:r>
-              <w:rPr>
-                <w:rFonts w:ascii="Arial" w:eastAsia="Arial" w:hAnsi="Arial" w:cs="Arial"/>
-                <w:color w:val="000000"/>
-                <w:sz w:val="20"/>
-                <w:szCs w:val="20"/>
-              </w:rPr>
-              <w:t>google_scholar</w:t>
-            </w:r>
-            <w:proofErr w:type="spellEnd"/>
+            <w:r>
+              <w:rPr>
+                <w:rFonts w:ascii="Arial" w:eastAsia="Arial" w:hAnsi="Arial" w:cs="Arial"/>
+                <w:color w:val="000000"/>
+                <w:sz w:val="20"/>
+                <w:szCs w:val="20"/>
+              </w:rPr>
+              <w:t>Google Scholar</w:t>
+            </w:r>
           </w:p>
         </w:tc>
         <w:tc>
@@ -2598,17 +2543,15 @@
                 <w:szCs w:val="20"/>
               </w:rPr>
             </w:pPr>
-            <w:proofErr w:type="spellStart"/>
-            <w:r>
-              <w:rPr>
-                <w:rFonts w:ascii="Arial" w:eastAsia="Arial" w:hAnsi="Arial" w:cs="Arial"/>
-                <w:color w:val="000000"/>
-                <w:sz w:val="20"/>
-                <w:szCs w:val="20"/>
-              </w:rPr>
-              <w:t>web_of_science</w:t>
-            </w:r>
-            <w:proofErr w:type="spellEnd"/>
+            <w:r>
+              <w:rPr>
+                <w:rFonts w:ascii="Arial" w:eastAsia="Arial" w:hAnsi="Arial" w:cs="Arial"/>
+                <w:color w:val="000000"/>
+                <w:sz w:val="20"/>
+                <w:szCs w:val="20"/>
+              </w:rPr>
+              <w:t>Web of Science</w:t>
+            </w:r>
           </w:p>
         </w:tc>
         <w:tc>
@@ -2740,17 +2683,15 @@
                 <w:szCs w:val="20"/>
               </w:rPr>
             </w:pPr>
-            <w:proofErr w:type="spellStart"/>
-            <w:r>
-              <w:rPr>
-                <w:rFonts w:ascii="Arial" w:eastAsia="Arial" w:hAnsi="Arial" w:cs="Arial"/>
-                <w:color w:val="000000"/>
-                <w:sz w:val="20"/>
-                <w:szCs w:val="20"/>
-              </w:rPr>
-              <w:t>embase</w:t>
-            </w:r>
-            <w:proofErr w:type="spellEnd"/>
+            <w:r>
+              <w:rPr>
+                <w:rFonts w:ascii="Arial" w:eastAsia="Arial" w:hAnsi="Arial" w:cs="Arial"/>
+                <w:color w:val="000000"/>
+                <w:sz w:val="20"/>
+                <w:szCs w:val="20"/>
+              </w:rPr>
+              <w:t>Embase</w:t>
+            </w:r>
           </w:p>
         </w:tc>
         <w:tc>
@@ -2882,17 +2823,15 @@
                 <w:szCs w:val="20"/>
               </w:rPr>
             </w:pPr>
-            <w:proofErr w:type="spellStart"/>
-            <w:r>
-              <w:rPr>
-                <w:rFonts w:ascii="Arial" w:eastAsia="Arial" w:hAnsi="Arial" w:cs="Arial"/>
-                <w:color w:val="000000"/>
-                <w:sz w:val="20"/>
-                <w:szCs w:val="20"/>
-              </w:rPr>
-              <w:t>medline</w:t>
-            </w:r>
-            <w:proofErr w:type="spellEnd"/>
+            <w:r>
+              <w:rPr>
+                <w:rFonts w:ascii="Arial" w:eastAsia="Arial" w:hAnsi="Arial" w:cs="Arial"/>
+                <w:color w:val="000000"/>
+                <w:sz w:val="20"/>
+                <w:szCs w:val="20"/>
+              </w:rPr>
+              <w:t>Medline</w:t>
+            </w:r>
           </w:p>
         </w:tc>
         <w:tc>
@@ -3024,17 +2963,15 @@
                 <w:szCs w:val="20"/>
               </w:rPr>
             </w:pPr>
-            <w:proofErr w:type="spellStart"/>
-            <w:r>
-              <w:rPr>
-                <w:rFonts w:ascii="Arial" w:eastAsia="Arial" w:hAnsi="Arial" w:cs="Arial"/>
-                <w:color w:val="000000"/>
-                <w:sz w:val="20"/>
-                <w:szCs w:val="20"/>
-              </w:rPr>
-              <w:t>cinahl</w:t>
-            </w:r>
-            <w:proofErr w:type="spellEnd"/>
+            <w:r>
+              <w:rPr>
+                <w:rFonts w:ascii="Arial" w:eastAsia="Arial" w:hAnsi="Arial" w:cs="Arial"/>
+                <w:color w:val="000000"/>
+                <w:sz w:val="20"/>
+                <w:szCs w:val="20"/>
+              </w:rPr>
+              <w:t>CINAHL</w:t>
+            </w:r>
           </w:p>
         </w:tc>
         <w:tc>
@@ -3173,7 +3110,7 @@
                 <w:sz w:val="20"/>
                 <w:szCs w:val="20"/>
               </w:rPr>
-              <w:t>eric</w:t>
+              <w:t>Eric</w:t>
             </w:r>
           </w:p>
         </w:tc>
@@ -3306,17 +3243,15 @@
                 <w:szCs w:val="20"/>
               </w:rPr>
             </w:pPr>
-            <w:proofErr w:type="spellStart"/>
-            <w:r>
-              <w:rPr>
-                <w:rFonts w:ascii="Arial" w:eastAsia="Arial" w:hAnsi="Arial" w:cs="Arial"/>
-                <w:color w:val="000000"/>
-                <w:sz w:val="20"/>
-                <w:szCs w:val="20"/>
-              </w:rPr>
-              <w:t>scopus</w:t>
-            </w:r>
-            <w:proofErr w:type="spellEnd"/>
+            <w:r>
+              <w:rPr>
+                <w:rFonts w:ascii="Arial" w:eastAsia="Arial" w:hAnsi="Arial" w:cs="Arial"/>
+                <w:color w:val="000000"/>
+                <w:sz w:val="20"/>
+                <w:szCs w:val="20"/>
+              </w:rPr>
+              <w:t>Scopus</w:t>
+            </w:r>
           </w:p>
         </w:tc>
         <w:tc>
@@ -3448,17 +3383,15 @@
                 <w:szCs w:val="20"/>
               </w:rPr>
             </w:pPr>
-            <w:proofErr w:type="spellStart"/>
-            <w:r>
-              <w:rPr>
-                <w:rFonts w:ascii="Arial" w:eastAsia="Arial" w:hAnsi="Arial" w:cs="Arial"/>
-                <w:color w:val="000000"/>
-                <w:sz w:val="20"/>
-                <w:szCs w:val="20"/>
-              </w:rPr>
-              <w:t>sociological_abstracts</w:t>
-            </w:r>
-            <w:proofErr w:type="spellEnd"/>
+            <w:r>
+              <w:rPr>
+                <w:rFonts w:ascii="Arial" w:eastAsia="Arial" w:hAnsi="Arial" w:cs="Arial"/>
+                <w:color w:val="000000"/>
+                <w:sz w:val="20"/>
+                <w:szCs w:val="20"/>
+              </w:rPr>
+              <w:t>Sociological Abstracts</w:t>
+            </w:r>
           </w:p>
         </w:tc>
         <w:tc>
@@ -3590,7 +3523,6 @@
                 <w:szCs w:val="20"/>
               </w:rPr>
             </w:pPr>
-            <w:proofErr w:type="spellStart"/>
             <w:r>
               <w:rPr>
                 <w:rFonts w:ascii="Arial" w:eastAsia="Arial" w:hAnsi="Arial" w:cs="Arial"/>
@@ -3599,9 +3531,8 @@
                 <w:szCs w:val="20"/>
               </w:rPr>
               <w:lastRenderedPageBreak/>
-              <w:t>cosmin</w:t>
-            </w:r>
-            <w:proofErr w:type="spellEnd"/>
+              <w:t>Cosmin</w:t>
+            </w:r>
           </w:p>
         </w:tc>
         <w:tc>
@@ -3733,17 +3664,15 @@
                 <w:szCs w:val="20"/>
               </w:rPr>
             </w:pPr>
-            <w:proofErr w:type="spellStart"/>
-            <w:r>
-              <w:rPr>
-                <w:rFonts w:ascii="Arial" w:eastAsia="Arial" w:hAnsi="Arial" w:cs="Arial"/>
-                <w:color w:val="000000"/>
-                <w:sz w:val="20"/>
-                <w:szCs w:val="20"/>
-              </w:rPr>
-              <w:t>eprovide</w:t>
-            </w:r>
-            <w:proofErr w:type="spellEnd"/>
+            <w:r>
+              <w:rPr>
+                <w:rFonts w:ascii="Arial" w:eastAsia="Arial" w:hAnsi="Arial" w:cs="Arial"/>
+                <w:color w:val="000000"/>
+                <w:sz w:val="20"/>
+                <w:szCs w:val="20"/>
+              </w:rPr>
+              <w:t>ePROVIDE</w:t>
+            </w:r>
           </w:p>
         </w:tc>
         <w:tc>
@@ -3875,17 +3804,15 @@
                 <w:szCs w:val="20"/>
               </w:rPr>
             </w:pPr>
-            <w:proofErr w:type="spellStart"/>
-            <w:r>
-              <w:rPr>
-                <w:rFonts w:ascii="Arial" w:eastAsia="Arial" w:hAnsi="Arial" w:cs="Arial"/>
-                <w:color w:val="000000"/>
-                <w:sz w:val="20"/>
-                <w:szCs w:val="20"/>
-              </w:rPr>
-              <w:t>proquest</w:t>
-            </w:r>
-            <w:proofErr w:type="spellEnd"/>
+            <w:r>
+              <w:rPr>
+                <w:rFonts w:ascii="Arial" w:eastAsia="Arial" w:hAnsi="Arial" w:cs="Arial"/>
+                <w:color w:val="000000"/>
+                <w:sz w:val="20"/>
+                <w:szCs w:val="20"/>
+              </w:rPr>
+              <w:t>ProQuest</w:t>
+            </w:r>
           </w:p>
         </w:tc>
         <w:tc>
@@ -4017,17 +3944,15 @@
                 <w:szCs w:val="20"/>
               </w:rPr>
             </w:pPr>
-            <w:proofErr w:type="spellStart"/>
-            <w:r>
-              <w:rPr>
-                <w:rFonts w:ascii="Arial" w:eastAsia="Arial" w:hAnsi="Arial" w:cs="Arial"/>
-                <w:color w:val="000000"/>
-                <w:sz w:val="20"/>
-                <w:szCs w:val="20"/>
-              </w:rPr>
-              <w:t>psycarticles</w:t>
-            </w:r>
-            <w:proofErr w:type="spellEnd"/>
+            <w:r>
+              <w:rPr>
+                <w:rFonts w:ascii="Arial" w:eastAsia="Arial" w:hAnsi="Arial" w:cs="Arial"/>
+                <w:color w:val="000000"/>
+                <w:sz w:val="20"/>
+                <w:szCs w:val="20"/>
+              </w:rPr>
+              <w:t>psycArticles</w:t>
+            </w:r>
           </w:p>
         </w:tc>
         <w:tc>
@@ -4159,17 +4084,15 @@
                 <w:szCs w:val="20"/>
               </w:rPr>
             </w:pPr>
-            <w:proofErr w:type="spellStart"/>
-            <w:r>
-              <w:rPr>
-                <w:rFonts w:ascii="Arial" w:eastAsia="Arial" w:hAnsi="Arial" w:cs="Arial"/>
-                <w:color w:val="000000"/>
-                <w:sz w:val="20"/>
-                <w:szCs w:val="20"/>
-              </w:rPr>
-              <w:t>ptsdpubs</w:t>
-            </w:r>
-            <w:proofErr w:type="spellEnd"/>
+            <w:r>
+              <w:rPr>
+                <w:rFonts w:ascii="Arial" w:eastAsia="Arial" w:hAnsi="Arial" w:cs="Arial"/>
+                <w:color w:val="000000"/>
+                <w:sz w:val="20"/>
+                <w:szCs w:val="20"/>
+              </w:rPr>
+              <w:t>PTSDpubs</w:t>
+            </w:r>
           </w:p>
         </w:tc>
         <w:tc>
@@ -4301,17 +4224,15 @@
                 <w:szCs w:val="20"/>
               </w:rPr>
             </w:pPr>
-            <w:proofErr w:type="spellStart"/>
-            <w:r>
-              <w:rPr>
-                <w:rFonts w:ascii="Arial" w:eastAsia="Arial" w:hAnsi="Arial" w:cs="Arial"/>
-                <w:color w:val="000000"/>
-                <w:sz w:val="20"/>
-                <w:szCs w:val="20"/>
-              </w:rPr>
-              <w:t>sciencedirect</w:t>
-            </w:r>
-            <w:proofErr w:type="spellEnd"/>
+            <w:r>
+              <w:rPr>
+                <w:rFonts w:ascii="Arial" w:eastAsia="Arial" w:hAnsi="Arial" w:cs="Arial"/>
+                <w:color w:val="000000"/>
+                <w:sz w:val="20"/>
+                <w:szCs w:val="20"/>
+              </w:rPr>
+              <w:t>ScienceDirect</w:t>
+            </w:r>
           </w:p>
         </w:tc>
         <w:tc>
@@ -4427,10 +4348,7 @@
         <w:ind w:left="60" w:right="60"/>
       </w:pPr>
       <w:r>
-        <w:t xml:space="preserve">Table S4 </w:t>
-      </w:r>
-      <w:r>
-        <w:t>Unit of comparison across analyses</w:t>
+        <w:t>Table S4 Unit of Comparison Across Analyses</w:t>
       </w:r>
     </w:p>
     <w:tbl>
@@ -4581,16 +4499,7 @@
                 <w:sz w:val="20"/>
                 <w:szCs w:val="20"/>
               </w:rPr>
-              <w:t>P</w:t>
-            </w:r>
-            <w:r>
-              <w:rPr>
-                <w:rFonts w:ascii="Arial" w:eastAsia="Arial" w:hAnsi="Arial" w:cs="Arial"/>
-                <w:color w:val="000000"/>
-                <w:sz w:val="20"/>
-                <w:szCs w:val="20"/>
-              </w:rPr>
-              <w:t>ercent</w:t>
+              <w:t>Percent</w:t>
             </w:r>
           </w:p>
         </w:tc>
@@ -4633,17 +4542,15 @@
                 <w:szCs w:val="20"/>
               </w:rPr>
             </w:pPr>
-            <w:proofErr w:type="spellStart"/>
-            <w:r>
-              <w:rPr>
-                <w:rFonts w:ascii="Arial" w:eastAsia="Arial" w:hAnsi="Arial" w:cs="Arial"/>
-                <w:color w:val="000000"/>
-                <w:sz w:val="20"/>
-                <w:szCs w:val="20"/>
-              </w:rPr>
-              <w:t>symptom_level</w:t>
-            </w:r>
-            <w:proofErr w:type="spellEnd"/>
+            <w:r>
+              <w:rPr>
+                <w:rFonts w:ascii="Arial" w:eastAsia="Arial" w:hAnsi="Arial" w:cs="Arial"/>
+                <w:color w:val="000000"/>
+                <w:sz w:val="20"/>
+                <w:szCs w:val="20"/>
+              </w:rPr>
+              <w:t>Symptom level</w:t>
+            </w:r>
           </w:p>
         </w:tc>
         <w:tc>
@@ -4775,17 +4682,15 @@
                 <w:szCs w:val="20"/>
               </w:rPr>
             </w:pPr>
-            <w:proofErr w:type="spellStart"/>
-            <w:r>
-              <w:rPr>
-                <w:rFonts w:ascii="Arial" w:eastAsia="Arial" w:hAnsi="Arial" w:cs="Arial"/>
-                <w:color w:val="000000"/>
-                <w:sz w:val="20"/>
-                <w:szCs w:val="20"/>
-              </w:rPr>
-              <w:t>category_level</w:t>
-            </w:r>
-            <w:proofErr w:type="spellEnd"/>
+            <w:r>
+              <w:rPr>
+                <w:rFonts w:ascii="Arial" w:eastAsia="Arial" w:hAnsi="Arial" w:cs="Arial"/>
+                <w:color w:val="000000"/>
+                <w:sz w:val="20"/>
+                <w:szCs w:val="20"/>
+              </w:rPr>
+              <w:t>Category level</w:t>
+            </w:r>
           </w:p>
         </w:tc>
         <w:tc>
@@ -4917,17 +4822,15 @@
                 <w:szCs w:val="20"/>
               </w:rPr>
             </w:pPr>
-            <w:proofErr w:type="spellStart"/>
-            <w:r>
-              <w:rPr>
-                <w:rFonts w:ascii="Arial" w:eastAsia="Arial" w:hAnsi="Arial" w:cs="Arial"/>
-                <w:color w:val="000000"/>
-                <w:sz w:val="20"/>
-                <w:szCs w:val="20"/>
-              </w:rPr>
-              <w:t>criterion_level</w:t>
-            </w:r>
-            <w:proofErr w:type="spellEnd"/>
+            <w:r>
+              <w:rPr>
+                <w:rFonts w:ascii="Arial" w:eastAsia="Arial" w:hAnsi="Arial" w:cs="Arial"/>
+                <w:color w:val="000000"/>
+                <w:sz w:val="20"/>
+                <w:szCs w:val="20"/>
+              </w:rPr>
+              <w:t>Criterion level</w:t>
+            </w:r>
           </w:p>
         </w:tc>
         <w:tc>
@@ -5059,17 +4962,15 @@
                 <w:szCs w:val="20"/>
               </w:rPr>
             </w:pPr>
-            <w:proofErr w:type="spellStart"/>
-            <w:r>
-              <w:rPr>
-                <w:rFonts w:ascii="Arial" w:eastAsia="Arial" w:hAnsi="Arial" w:cs="Arial"/>
-                <w:color w:val="000000"/>
-                <w:sz w:val="20"/>
-                <w:szCs w:val="20"/>
-              </w:rPr>
-              <w:t>item_level</w:t>
-            </w:r>
-            <w:proofErr w:type="spellEnd"/>
+            <w:r>
+              <w:rPr>
+                <w:rFonts w:ascii="Arial" w:eastAsia="Arial" w:hAnsi="Arial" w:cs="Arial"/>
+                <w:color w:val="000000"/>
+                <w:sz w:val="20"/>
+                <w:szCs w:val="20"/>
+              </w:rPr>
+              <w:t>Item level</w:t>
+            </w:r>
           </w:p>
         </w:tc>
         <w:tc>
@@ -5201,17 +5102,15 @@
                 <w:szCs w:val="20"/>
               </w:rPr>
             </w:pPr>
-            <w:proofErr w:type="spellStart"/>
-            <w:r>
-              <w:rPr>
-                <w:rFonts w:ascii="Arial" w:eastAsia="Arial" w:hAnsi="Arial" w:cs="Arial"/>
-                <w:color w:val="000000"/>
-                <w:sz w:val="20"/>
-                <w:szCs w:val="20"/>
-              </w:rPr>
-              <w:t>semantic_level</w:t>
-            </w:r>
-            <w:proofErr w:type="spellEnd"/>
+            <w:r>
+              <w:rPr>
+                <w:rFonts w:ascii="Arial" w:eastAsia="Arial" w:hAnsi="Arial" w:cs="Arial"/>
+                <w:color w:val="000000"/>
+                <w:sz w:val="20"/>
+                <w:szCs w:val="20"/>
+              </w:rPr>
+              <w:t>Semantic level</w:t>
+            </w:r>
           </w:p>
         </w:tc>
         <w:tc>
@@ -5327,10 +5226,7 @@
         <w:ind w:left="60" w:right="60"/>
       </w:pPr>
       <w:r>
-        <w:t xml:space="preserve">Table S5 </w:t>
-      </w:r>
-      <w:r>
-        <w:t>Categorization approach</w:t>
+        <w:t>Table S5 Categorization Approach</w:t>
       </w:r>
     </w:p>
     <w:tbl>
@@ -5391,34 +5287,7 @@
                 <w:sz w:val="20"/>
                 <w:szCs w:val="20"/>
               </w:rPr>
-              <w:t>C</w:t>
-            </w:r>
-            <w:r>
-              <w:rPr>
-                <w:rFonts w:ascii="Arial" w:eastAsia="Arial" w:hAnsi="Arial" w:cs="Arial"/>
-                <w:color w:val="000000"/>
-                <w:sz w:val="20"/>
-                <w:szCs w:val="20"/>
-              </w:rPr>
-              <w:t>ategorization</w:t>
-            </w:r>
-            <w:r>
-              <w:rPr>
-                <w:rFonts w:ascii="Arial" w:eastAsia="Arial" w:hAnsi="Arial" w:cs="Arial"/>
-                <w:color w:val="000000"/>
-                <w:sz w:val="20"/>
-                <w:szCs w:val="20"/>
-              </w:rPr>
-              <w:t xml:space="preserve"> </w:t>
-            </w:r>
-            <w:r>
-              <w:rPr>
-                <w:rFonts w:ascii="Arial" w:eastAsia="Arial" w:hAnsi="Arial" w:cs="Arial"/>
-                <w:color w:val="000000"/>
-                <w:sz w:val="20"/>
-                <w:szCs w:val="20"/>
-              </w:rPr>
-              <w:t>approach</w:t>
+              <w:t>Categorization approach</w:t>
             </w:r>
           </w:p>
         </w:tc>
@@ -5508,16 +5377,7 @@
                 <w:sz w:val="20"/>
                 <w:szCs w:val="20"/>
               </w:rPr>
-              <w:t>P</w:t>
-            </w:r>
-            <w:r>
-              <w:rPr>
-                <w:rFonts w:ascii="Arial" w:eastAsia="Arial" w:hAnsi="Arial" w:cs="Arial"/>
-                <w:color w:val="000000"/>
-                <w:sz w:val="20"/>
-                <w:szCs w:val="20"/>
-              </w:rPr>
-              <w:t>ercent</w:t>
+              <w:t>Percent</w:t>
             </w:r>
           </w:p>
         </w:tc>
@@ -5560,17 +5420,15 @@
                 <w:szCs w:val="20"/>
               </w:rPr>
             </w:pPr>
-            <w:proofErr w:type="spellStart"/>
-            <w:r>
-              <w:rPr>
-                <w:rFonts w:ascii="Arial" w:eastAsia="Arial" w:hAnsi="Arial" w:cs="Arial"/>
-                <w:color w:val="000000"/>
-                <w:sz w:val="20"/>
-                <w:szCs w:val="20"/>
-              </w:rPr>
-              <w:t>bottom_up</w:t>
-            </w:r>
-            <w:proofErr w:type="spellEnd"/>
+            <w:r>
+              <w:rPr>
+                <w:rFonts w:ascii="Arial" w:eastAsia="Arial" w:hAnsi="Arial" w:cs="Arial"/>
+                <w:color w:val="000000"/>
+                <w:sz w:val="20"/>
+                <w:szCs w:val="20"/>
+              </w:rPr>
+              <w:t>Bottom up</w:t>
+            </w:r>
           </w:p>
         </w:tc>
         <w:tc>
@@ -5709,7 +5567,7 @@
                 <w:sz w:val="20"/>
                 <w:szCs w:val="20"/>
               </w:rPr>
-              <w:t>mixed</w:t>
+              <w:t>Mixed</w:t>
             </w:r>
           </w:p>
         </w:tc>
@@ -5842,17 +5700,15 @@
                 <w:szCs w:val="20"/>
               </w:rPr>
             </w:pPr>
-            <w:proofErr w:type="spellStart"/>
-            <w:r>
-              <w:rPr>
-                <w:rFonts w:ascii="Arial" w:eastAsia="Arial" w:hAnsi="Arial" w:cs="Arial"/>
-                <w:color w:val="000000"/>
-                <w:sz w:val="20"/>
-                <w:szCs w:val="20"/>
-              </w:rPr>
-              <w:t>top_down</w:t>
-            </w:r>
-            <w:proofErr w:type="spellEnd"/>
+            <w:r>
+              <w:rPr>
+                <w:rFonts w:ascii="Arial" w:eastAsia="Arial" w:hAnsi="Arial" w:cs="Arial"/>
+                <w:color w:val="000000"/>
+                <w:sz w:val="20"/>
+                <w:szCs w:val="20"/>
+              </w:rPr>
+              <w:t>Top down</w:t>
+            </w:r>
           </w:p>
         </w:tc>
         <w:tc>
@@ -5968,10 +5824,7 @@
         <w:ind w:left="60" w:right="60"/>
       </w:pPr>
       <w:r>
-        <w:t xml:space="preserve">Table S6 </w:t>
-      </w:r>
-      <w:r>
-        <w:t>Diagnostic frameworks referenced</w:t>
+        <w:t>Table S6 Diagnostic Frameworks Referenced</w:t>
       </w:r>
     </w:p>
     <w:tbl>
@@ -6032,34 +5885,7 @@
                 <w:sz w:val="20"/>
                 <w:szCs w:val="20"/>
               </w:rPr>
-              <w:t>D</w:t>
-            </w:r>
-            <w:r>
-              <w:rPr>
-                <w:rFonts w:ascii="Arial" w:eastAsia="Arial" w:hAnsi="Arial" w:cs="Arial"/>
-                <w:color w:val="000000"/>
-                <w:sz w:val="20"/>
-                <w:szCs w:val="20"/>
-              </w:rPr>
-              <w:t>iagnostic</w:t>
-            </w:r>
-            <w:r>
-              <w:rPr>
-                <w:rFonts w:ascii="Arial" w:eastAsia="Arial" w:hAnsi="Arial" w:cs="Arial"/>
-                <w:color w:val="000000"/>
-                <w:sz w:val="20"/>
-                <w:szCs w:val="20"/>
-              </w:rPr>
-              <w:t xml:space="preserve"> F</w:t>
-            </w:r>
-            <w:r>
-              <w:rPr>
-                <w:rFonts w:ascii="Arial" w:eastAsia="Arial" w:hAnsi="Arial" w:cs="Arial"/>
-                <w:color w:val="000000"/>
-                <w:sz w:val="20"/>
-                <w:szCs w:val="20"/>
-              </w:rPr>
-              <w:t>ramework</w:t>
+              <w:t>Diagnostic Framework</w:t>
             </w:r>
           </w:p>
         </w:tc>
@@ -6149,7 +5975,7 @@
                 <w:sz w:val="20"/>
                 <w:szCs w:val="20"/>
               </w:rPr>
-              <w:t>percent</w:t>
+              <w:t>Percent</w:t>
             </w:r>
           </w:p>
         </w:tc>
@@ -6199,7 +6025,7 @@
                 <w:sz w:val="20"/>
                 <w:szCs w:val="20"/>
               </w:rPr>
-              <w:t>none</w:t>
+              <w:t>None</w:t>
             </w:r>
           </w:p>
         </w:tc>
@@ -6332,17 +6158,15 @@
                 <w:szCs w:val="20"/>
               </w:rPr>
             </w:pPr>
-            <w:proofErr w:type="spellStart"/>
-            <w:r>
-              <w:rPr>
-                <w:rFonts w:ascii="Arial" w:eastAsia="Arial" w:hAnsi="Arial" w:cs="Arial"/>
-                <w:color w:val="000000"/>
-                <w:sz w:val="20"/>
-                <w:szCs w:val="20"/>
-              </w:rPr>
-              <w:t>dsm</w:t>
-            </w:r>
-            <w:proofErr w:type="spellEnd"/>
+            <w:r>
+              <w:rPr>
+                <w:rFonts w:ascii="Arial" w:eastAsia="Arial" w:hAnsi="Arial" w:cs="Arial"/>
+                <w:color w:val="000000"/>
+                <w:sz w:val="20"/>
+                <w:szCs w:val="20"/>
+              </w:rPr>
+              <w:t>DSM</w:t>
+            </w:r>
           </w:p>
         </w:tc>
         <w:tc>
@@ -6481,7 +6305,7 @@
                 <w:sz w:val="20"/>
                 <w:szCs w:val="20"/>
               </w:rPr>
-              <w:t>other</w:t>
+              <w:t>Other</w:t>
             </w:r>
           </w:p>
         </w:tc>
@@ -6614,17 +6438,15 @@
                 <w:szCs w:val="20"/>
               </w:rPr>
             </w:pPr>
-            <w:proofErr w:type="spellStart"/>
-            <w:r>
-              <w:rPr>
-                <w:rFonts w:ascii="Arial" w:eastAsia="Arial" w:hAnsi="Arial" w:cs="Arial"/>
-                <w:color w:val="000000"/>
-                <w:sz w:val="20"/>
-                <w:szCs w:val="20"/>
-              </w:rPr>
-              <w:t>icd</w:t>
-            </w:r>
-            <w:proofErr w:type="spellEnd"/>
+            <w:r>
+              <w:rPr>
+                <w:rFonts w:ascii="Arial" w:eastAsia="Arial" w:hAnsi="Arial" w:cs="Arial"/>
+                <w:color w:val="000000"/>
+                <w:sz w:val="20"/>
+                <w:szCs w:val="20"/>
+              </w:rPr>
+              <w:t>ICD</w:t>
+            </w:r>
           </w:p>
         </w:tc>
         <w:tc>
@@ -6756,17 +6578,15 @@
                 <w:szCs w:val="20"/>
               </w:rPr>
             </w:pPr>
-            <w:proofErr w:type="spellStart"/>
-            <w:r>
-              <w:rPr>
-                <w:rFonts w:ascii="Arial" w:eastAsia="Arial" w:hAnsi="Arial" w:cs="Arial"/>
-                <w:color w:val="000000"/>
-                <w:sz w:val="20"/>
-                <w:szCs w:val="20"/>
-              </w:rPr>
-              <w:t>who_definition</w:t>
-            </w:r>
-            <w:proofErr w:type="spellEnd"/>
+            <w:r>
+              <w:rPr>
+                <w:rFonts w:ascii="Arial" w:eastAsia="Arial" w:hAnsi="Arial" w:cs="Arial"/>
+                <w:color w:val="000000"/>
+                <w:sz w:val="20"/>
+                <w:szCs w:val="20"/>
+              </w:rPr>
+              <w:t>WHO definition</w:t>
+            </w:r>
           </w:p>
         </w:tc>
         <w:tc>
@@ -6905,7 +6725,7 @@
                 <w:sz w:val="20"/>
                 <w:szCs w:val="20"/>
               </w:rPr>
-              <w:t>guideline</w:t>
+              <w:t>Guideline</w:t>
             </w:r>
           </w:p>
         </w:tc>
@@ -7023,10 +6843,7 @@
       </w:pPr>
       <w:r>
         <w:lastRenderedPageBreak/>
-        <w:t xml:space="preserve">Table S7 </w:t>
-      </w:r>
-      <w:r>
-        <w:t>Percentage reduction by unit type</w:t>
+        <w:t>Table S7 Percentage Reduction by Unit Type</w:t>
       </w:r>
     </w:p>
     <w:tbl>
@@ -7222,7 +7039,6 @@
                 <w:szCs w:val="20"/>
               </w:rPr>
             </w:pPr>
-            <w:proofErr w:type="spellStart"/>
             <w:r>
               <w:rPr>
                 <w:rFonts w:ascii="Arial" w:eastAsia="Arial" w:hAnsi="Arial" w:cs="Arial"/>
@@ -7232,7 +7048,6 @@
               </w:rPr>
               <w:t>sd</w:t>
             </w:r>
-            <w:proofErr w:type="spellEnd"/>
           </w:p>
         </w:tc>
         <w:tc>
@@ -7314,7 +7129,6 @@
                 <w:szCs w:val="20"/>
               </w:rPr>
             </w:pPr>
-            <w:proofErr w:type="spellStart"/>
             <w:r>
               <w:rPr>
                 <w:rFonts w:ascii="Arial" w:eastAsia="Arial" w:hAnsi="Arial" w:cs="Arial"/>
@@ -7324,7 +7138,6 @@
               </w:rPr>
               <w:t>iqr</w:t>
             </w:r>
-            <w:proofErr w:type="spellEnd"/>
           </w:p>
         </w:tc>
         <w:tc>
@@ -7546,17 +7359,15 @@
                 <w:szCs w:val="20"/>
               </w:rPr>
             </w:pPr>
-            <w:proofErr w:type="spellStart"/>
-            <w:r>
-              <w:rPr>
-                <w:rFonts w:ascii="Arial" w:eastAsia="Arial" w:hAnsi="Arial" w:cs="Arial"/>
-                <w:color w:val="000000"/>
-                <w:sz w:val="20"/>
-                <w:szCs w:val="20"/>
-              </w:rPr>
-              <w:t>symptom_level</w:t>
-            </w:r>
-            <w:proofErr w:type="spellEnd"/>
+            <w:r>
+              <w:rPr>
+                <w:rFonts w:ascii="Arial" w:eastAsia="Arial" w:hAnsi="Arial" w:cs="Arial"/>
+                <w:color w:val="000000"/>
+                <w:sz w:val="20"/>
+                <w:szCs w:val="20"/>
+              </w:rPr>
+              <w:t>Symptom level</w:t>
+            </w:r>
           </w:p>
         </w:tc>
         <w:tc>
@@ -8003,17 +7814,15 @@
                 <w:szCs w:val="20"/>
               </w:rPr>
             </w:pPr>
-            <w:proofErr w:type="spellStart"/>
-            <w:r>
-              <w:rPr>
-                <w:rFonts w:ascii="Arial" w:eastAsia="Arial" w:hAnsi="Arial" w:cs="Arial"/>
-                <w:color w:val="000000"/>
-                <w:sz w:val="20"/>
-                <w:szCs w:val="20"/>
-              </w:rPr>
-              <w:t>category_level</w:t>
-            </w:r>
-            <w:proofErr w:type="spellEnd"/>
+            <w:r>
+              <w:rPr>
+                <w:rFonts w:ascii="Arial" w:eastAsia="Arial" w:hAnsi="Arial" w:cs="Arial"/>
+                <w:color w:val="000000"/>
+                <w:sz w:val="20"/>
+                <w:szCs w:val="20"/>
+              </w:rPr>
+              <w:t>Category level</w:t>
+            </w:r>
           </w:p>
         </w:tc>
         <w:tc>
@@ -8460,17 +8269,15 @@
                 <w:szCs w:val="20"/>
               </w:rPr>
             </w:pPr>
-            <w:proofErr w:type="spellStart"/>
-            <w:r>
-              <w:rPr>
-                <w:rFonts w:ascii="Arial" w:eastAsia="Arial" w:hAnsi="Arial" w:cs="Arial"/>
-                <w:color w:val="000000"/>
-                <w:sz w:val="20"/>
-                <w:szCs w:val="20"/>
-              </w:rPr>
-              <w:t>criterion_level</w:t>
-            </w:r>
-            <w:proofErr w:type="spellEnd"/>
+            <w:r>
+              <w:rPr>
+                <w:rFonts w:ascii="Arial" w:eastAsia="Arial" w:hAnsi="Arial" w:cs="Arial"/>
+                <w:color w:val="000000"/>
+                <w:sz w:val="20"/>
+                <w:szCs w:val="20"/>
+              </w:rPr>
+              <w:t>Criterion level</w:t>
+            </w:r>
           </w:p>
         </w:tc>
         <w:tc>
@@ -8917,17 +8724,15 @@
                 <w:szCs w:val="20"/>
               </w:rPr>
             </w:pPr>
-            <w:proofErr w:type="spellStart"/>
-            <w:r>
-              <w:rPr>
-                <w:rFonts w:ascii="Arial" w:eastAsia="Arial" w:hAnsi="Arial" w:cs="Arial"/>
-                <w:color w:val="000000"/>
-                <w:sz w:val="20"/>
-                <w:szCs w:val="20"/>
-              </w:rPr>
-              <w:t>item_level</w:t>
-            </w:r>
-            <w:proofErr w:type="spellEnd"/>
+            <w:r>
+              <w:rPr>
+                <w:rFonts w:ascii="Arial" w:eastAsia="Arial" w:hAnsi="Arial" w:cs="Arial"/>
+                <w:color w:val="000000"/>
+                <w:sz w:val="20"/>
+                <w:szCs w:val="20"/>
+              </w:rPr>
+              <w:t>Item level</w:t>
+            </w:r>
           </w:p>
         </w:tc>
         <w:tc>
@@ -9365,17 +9170,15 @@
                 <w:szCs w:val="20"/>
               </w:rPr>
             </w:pPr>
-            <w:proofErr w:type="spellStart"/>
-            <w:r>
-              <w:rPr>
-                <w:rFonts w:ascii="Arial" w:eastAsia="Arial" w:hAnsi="Arial" w:cs="Arial"/>
-                <w:color w:val="000000"/>
-                <w:sz w:val="20"/>
-                <w:szCs w:val="20"/>
-              </w:rPr>
-              <w:t>semantic_level</w:t>
-            </w:r>
-            <w:proofErr w:type="spellEnd"/>
+            <w:r>
+              <w:rPr>
+                <w:rFonts w:ascii="Arial" w:eastAsia="Arial" w:hAnsi="Arial" w:cs="Arial"/>
+                <w:color w:val="000000"/>
+                <w:sz w:val="20"/>
+                <w:szCs w:val="20"/>
+              </w:rPr>
+              <w:t>Semantic level</w:t>
+            </w:r>
           </w:p>
         </w:tc>
         <w:tc>
@@ -9804,16 +9607,7 @@
         <w:ind w:left="60" w:right="60"/>
       </w:pPr>
       <w:r>
-        <w:t xml:space="preserve">Table S8 </w:t>
-      </w:r>
-      <w:r>
-        <w:t>Initial</w:t>
-      </w:r>
-      <w:r>
-        <w:t xml:space="preserve"> coding</w:t>
-      </w:r>
-      <w:r>
-        <w:t xml:space="preserve"> team distribution</w:t>
+        <w:t>Table S8 Initial Coding Team Distribution</w:t>
       </w:r>
     </w:p>
     <w:tbl>
@@ -9867,17 +9661,15 @@
                 <w:szCs w:val="20"/>
               </w:rPr>
             </w:pPr>
-            <w:proofErr w:type="spellStart"/>
-            <w:r>
-              <w:rPr>
-                <w:rFonts w:ascii="Arial" w:eastAsia="Arial" w:hAnsi="Arial" w:cs="Arial"/>
-                <w:color w:val="000000"/>
-                <w:sz w:val="20"/>
-                <w:szCs w:val="20"/>
-              </w:rPr>
-              <w:t>initial_coding_team_size</w:t>
-            </w:r>
-            <w:proofErr w:type="spellEnd"/>
+            <w:r>
+              <w:rPr>
+                <w:rFonts w:ascii="Arial" w:eastAsia="Arial" w:hAnsi="Arial" w:cs="Arial"/>
+                <w:color w:val="000000"/>
+                <w:sz w:val="20"/>
+                <w:szCs w:val="20"/>
+              </w:rPr>
+              <w:t>Initial coding team size</w:t>
+            </w:r>
           </w:p>
         </w:tc>
         <w:tc>
@@ -9966,7 +9758,7 @@
                 <w:sz w:val="20"/>
                 <w:szCs w:val="20"/>
               </w:rPr>
-              <w:t>percent</w:t>
+              <w:t>Percent</w:t>
             </w:r>
           </w:p>
         </w:tc>
@@ -10700,10 +10492,7 @@
         <w:ind w:left="60" w:right="60"/>
       </w:pPr>
       <w:r>
-        <w:t xml:space="preserve">Table S9 </w:t>
-      </w:r>
-      <w:r>
-        <w:t>Rater team distribution</w:t>
+        <w:t>Table S9 Rater Team Distribution</w:t>
       </w:r>
     </w:p>
     <w:tbl>
@@ -10757,17 +10546,15 @@
                 <w:szCs w:val="20"/>
               </w:rPr>
             </w:pPr>
-            <w:proofErr w:type="spellStart"/>
-            <w:r>
-              <w:rPr>
-                <w:rFonts w:ascii="Arial" w:eastAsia="Arial" w:hAnsi="Arial" w:cs="Arial"/>
-                <w:color w:val="000000"/>
-                <w:sz w:val="20"/>
-                <w:szCs w:val="20"/>
-              </w:rPr>
-              <w:t>n_rater</w:t>
-            </w:r>
-            <w:proofErr w:type="spellEnd"/>
+            <w:r>
+              <w:rPr>
+                <w:rFonts w:ascii="Arial" w:eastAsia="Arial" w:hAnsi="Arial" w:cs="Arial"/>
+                <w:color w:val="000000"/>
+                <w:sz w:val="20"/>
+                <w:szCs w:val="20"/>
+              </w:rPr>
+              <w:t>Number of Raters</w:t>
+            </w:r>
           </w:p>
         </w:tc>
         <w:tc>
@@ -10856,7 +10643,7 @@
                 <w:sz w:val="20"/>
                 <w:szCs w:val="20"/>
               </w:rPr>
-              <w:t>percent</w:t>
+              <w:t>Percent</w:t>
             </w:r>
           </w:p>
         </w:tc>
@@ -12011,10 +11798,7 @@
         <w:ind w:left="60" w:right="60"/>
       </w:pPr>
       <w:r>
-        <w:t xml:space="preserve">Table S10 </w:t>
-      </w:r>
-      <w:r>
-        <w:t>Coding team expansion</w:t>
+        <w:t>Table S10 Coding Team Expansion</w:t>
       </w:r>
     </w:p>
     <w:tbl>
@@ -12075,7 +11859,7 @@
                 <w:sz w:val="20"/>
                 <w:szCs w:val="20"/>
               </w:rPr>
-              <w:t>expanded</w:t>
+              <w:t>Expanded</w:t>
             </w:r>
           </w:p>
         </w:tc>
@@ -12165,7 +11949,7 @@
                 <w:sz w:val="20"/>
                 <w:szCs w:val="20"/>
               </w:rPr>
-              <w:t>percent</w:t>
+              <w:t>Percent</w:t>
             </w:r>
           </w:p>
         </w:tc>
@@ -12215,7 +11999,7 @@
                 <w:sz w:val="20"/>
                 <w:szCs w:val="20"/>
               </w:rPr>
-              <w:t>false</w:t>
+              <w:t>False</w:t>
             </w:r>
           </w:p>
         </w:tc>
@@ -12356,7 +12140,7 @@
                 <w:szCs w:val="20"/>
               </w:rPr>
               <w:lastRenderedPageBreak/>
-              <w:t>true</w:t>
+              <w:t>True</w:t>
             </w:r>
           </w:p>
         </w:tc>
@@ -12480,16 +12264,7 @@
         <w:ind w:left="60" w:right="60"/>
       </w:pPr>
       <w:r>
-        <w:t>Table S1</w:t>
-      </w:r>
-      <w:r>
-        <w:t>1</w:t>
-      </w:r>
-      <w:r>
-        <w:t xml:space="preserve"> </w:t>
-      </w:r>
-      <w:r>
-        <w:t>Additional Coding Descriptives</w:t>
+        <w:t>Table S11 Additional Coding Descriptives</w:t>
       </w:r>
     </w:p>
     <w:tbl>
@@ -12641,7 +12416,7 @@
                 <w:sz w:val="20"/>
                 <w:szCs w:val="20"/>
               </w:rPr>
-              <w:t>denominator</w:t>
+              <w:t>Denominator</w:t>
             </w:r>
           </w:p>
         </w:tc>
@@ -12686,7 +12461,7 @@
                 <w:sz w:val="20"/>
                 <w:szCs w:val="20"/>
               </w:rPr>
-              <w:t>report</w:t>
+              <w:t>Report</w:t>
             </w:r>
           </w:p>
         </w:tc>
@@ -13083,10 +12858,7 @@
         <w:ind w:left="60" w:right="60"/>
       </w:pPr>
       <w:r>
-        <w:t xml:space="preserve">Table S12 </w:t>
-      </w:r>
-      <w:r>
-        <w:t>Software used</w:t>
+        <w:t>Table S12 Software Used</w:t>
       </w:r>
     </w:p>
     <w:tbl>
@@ -13865,10 +13637,7 @@
         <w:ind w:left="60" w:right="60"/>
       </w:pPr>
       <w:r>
-        <w:t xml:space="preserve">Table S13 </w:t>
-      </w:r>
-      <w:r>
-        <w:t>Summary of Overlap Values</w:t>
+        <w:t>Table S13 Summary of Overlap Values</w:t>
       </w:r>
     </w:p>
     <w:tbl>
@@ -13932,7 +13701,7 @@
                 <w:sz w:val="20"/>
                 <w:szCs w:val="20"/>
               </w:rPr>
-              <w:t>metric</w:t>
+              <w:t>Summary metric</w:t>
             </w:r>
           </w:p>
         </w:tc>
@@ -15009,16 +14778,7 @@
         <w:ind w:left="60" w:right="60"/>
       </w:pPr>
       <w:r>
-        <w:t>Table S1</w:t>
-      </w:r>
-      <w:r>
-        <w:t>4</w:t>
-      </w:r>
-      <w:r>
-        <w:t xml:space="preserve"> </w:t>
-      </w:r>
-      <w:r>
-        <w:t>Types of reported length correlations</w:t>
+        <w:t>Table S14 Types of Reported Length Correlations</w:t>
       </w:r>
     </w:p>
     <w:tbl>
@@ -15258,17 +15018,15 @@
                 <w:szCs w:val="20"/>
               </w:rPr>
             </w:pPr>
-            <w:proofErr w:type="spellStart"/>
-            <w:r>
-              <w:rPr>
-                <w:rFonts w:ascii="Arial" w:eastAsia="Arial" w:hAnsi="Arial" w:cs="Arial"/>
-                <w:color w:val="000000"/>
-                <w:sz w:val="20"/>
-                <w:szCs w:val="20"/>
-              </w:rPr>
-              <w:t>positive_numeric</w:t>
-            </w:r>
-            <w:proofErr w:type="spellEnd"/>
+            <w:r>
+              <w:rPr>
+                <w:rFonts w:ascii="Arial" w:eastAsia="Arial" w:hAnsi="Arial" w:cs="Arial"/>
+                <w:color w:val="000000"/>
+                <w:sz w:val="20"/>
+                <w:szCs w:val="20"/>
+              </w:rPr>
+              <w:t>Positive numeric</w:t>
+            </w:r>
           </w:p>
         </w:tc>
         <w:tc>
@@ -15445,17 +15203,15 @@
                 <w:szCs w:val="20"/>
               </w:rPr>
             </w:pPr>
-            <w:proofErr w:type="spellStart"/>
-            <w:r>
-              <w:rPr>
-                <w:rFonts w:ascii="Arial" w:eastAsia="Arial" w:hAnsi="Arial" w:cs="Arial"/>
-                <w:color w:val="000000"/>
-                <w:sz w:val="20"/>
-                <w:szCs w:val="20"/>
-              </w:rPr>
-              <w:t>positive_text_only</w:t>
-            </w:r>
-            <w:proofErr w:type="spellEnd"/>
+            <w:r>
+              <w:rPr>
+                <w:rFonts w:ascii="Arial" w:eastAsia="Arial" w:hAnsi="Arial" w:cs="Arial"/>
+                <w:color w:val="000000"/>
+                <w:sz w:val="20"/>
+                <w:szCs w:val="20"/>
+              </w:rPr>
+              <w:t>Positive text only</w:t>
+            </w:r>
           </w:p>
         </w:tc>
         <w:tc>
@@ -15632,17 +15388,15 @@
                 <w:szCs w:val="20"/>
               </w:rPr>
             </w:pPr>
-            <w:proofErr w:type="spellStart"/>
-            <w:r>
-              <w:rPr>
-                <w:rFonts w:ascii="Arial" w:eastAsia="Arial" w:hAnsi="Arial" w:cs="Arial"/>
-                <w:color w:val="000000"/>
-                <w:sz w:val="20"/>
-                <w:szCs w:val="20"/>
-              </w:rPr>
-              <w:t>null_numeric</w:t>
-            </w:r>
-            <w:proofErr w:type="spellEnd"/>
+            <w:r>
+              <w:rPr>
+                <w:rFonts w:ascii="Arial" w:eastAsia="Arial" w:hAnsi="Arial" w:cs="Arial"/>
+                <w:color w:val="000000"/>
+                <w:sz w:val="20"/>
+                <w:szCs w:val="20"/>
+              </w:rPr>
+              <w:t>Null numeric</w:t>
+            </w:r>
           </w:p>
         </w:tc>
         <w:tc>
@@ -15819,17 +15573,15 @@
                 <w:szCs w:val="20"/>
               </w:rPr>
             </w:pPr>
-            <w:proofErr w:type="spellStart"/>
-            <w:r>
-              <w:rPr>
-                <w:rFonts w:ascii="Arial" w:eastAsia="Arial" w:hAnsi="Arial" w:cs="Arial"/>
-                <w:color w:val="000000"/>
-                <w:sz w:val="20"/>
-                <w:szCs w:val="20"/>
-              </w:rPr>
-              <w:t>other_unclear</w:t>
-            </w:r>
-            <w:proofErr w:type="spellEnd"/>
+            <w:r>
+              <w:rPr>
+                <w:rFonts w:ascii="Arial" w:eastAsia="Arial" w:hAnsi="Arial" w:cs="Arial"/>
+                <w:color w:val="000000"/>
+                <w:sz w:val="20"/>
+                <w:szCs w:val="20"/>
+              </w:rPr>
+              <w:t>Other unclear</w:t>
+            </w:r>
           </w:p>
         </w:tc>
         <w:tc>
@@ -16006,17 +15758,15 @@
                 <w:szCs w:val="20"/>
               </w:rPr>
             </w:pPr>
-            <w:proofErr w:type="spellStart"/>
-            <w:r>
-              <w:rPr>
-                <w:rFonts w:ascii="Arial" w:eastAsia="Arial" w:hAnsi="Arial" w:cs="Arial"/>
-                <w:color w:val="000000"/>
-                <w:sz w:val="20"/>
-                <w:szCs w:val="20"/>
-              </w:rPr>
-              <w:t>null_text_only</w:t>
-            </w:r>
-            <w:proofErr w:type="spellEnd"/>
+            <w:r>
+              <w:rPr>
+                <w:rFonts w:ascii="Arial" w:eastAsia="Arial" w:hAnsi="Arial" w:cs="Arial"/>
+                <w:color w:val="000000"/>
+                <w:sz w:val="20"/>
+                <w:szCs w:val="20"/>
+              </w:rPr>
+              <w:t>Null text only</w:t>
+            </w:r>
           </w:p>
         </w:tc>
         <w:tc>
@@ -16177,10 +15927,7 @@
         <w:ind w:left="60" w:right="60"/>
       </w:pPr>
       <w:r>
-        <w:t xml:space="preserve">Table S15 </w:t>
-      </w:r>
-      <w:r>
-        <w:t>How authors described overlap strength</w:t>
+        <w:t>Table S15 How Authors Described Overlap Strength</w:t>
       </w:r>
     </w:p>
     <w:tbl>
@@ -17127,7 +16874,7 @@
     <w:p>
       <w:pPr>
         <w:rPr>
-          <w:lang w:val="de-CH"/>
+          <w:lang w:val="en-GB"/>
         </w:rPr>
       </w:pPr>
     </w:p>
@@ -18102,20 +17849,8 @@
                 <w:lang w:val="en-CH" w:eastAsia="en-CH"/>
                 <w14:ligatures w14:val="none"/>
               </w:rPr>
-              <w:t xml:space="preserve">Childhood aggressive </w:t>
-            </w:r>
-            <w:proofErr w:type="spellStart"/>
-            <w:r>
-              <w:rPr>
-                <w:rFonts w:ascii="Aptos Narrow" w:eastAsia="Times New Roman" w:hAnsi="Aptos Narrow" w:cs="Times New Roman"/>
-                <w:color w:val="000000"/>
-                <w:kern w:val="0"/>
-                <w:lang w:val="en-CH" w:eastAsia="en-CH"/>
-                <w14:ligatures w14:val="none"/>
-              </w:rPr>
-              <w:t>behaviors</w:t>
-            </w:r>
-            <w:proofErr w:type="spellEnd"/>
+              <w:t>Childhood aggressive behaviors</w:t>
+            </w:r>
           </w:p>
         </w:tc>
         <w:tc>
@@ -18894,23 +18629,7 @@
                 <w:rFonts w:ascii="Aptos Narrow" w:hAnsi="Aptos Narrow" w:cs="Times New Roman"/>
                 <w:kern w:val="0"/>
               </w:rPr>
-              <w:t>(</w:t>
-            </w:r>
-            <w:proofErr w:type="spellStart"/>
-            <w:r>
-              <w:rPr>
-                <w:rFonts w:ascii="Aptos Narrow" w:hAnsi="Aptos Narrow" w:cs="Times New Roman"/>
-                <w:kern w:val="0"/>
-              </w:rPr>
-              <w:t>Peipert</w:t>
-            </w:r>
-            <w:proofErr w:type="spellEnd"/>
-            <w:r>
-              <w:rPr>
-                <w:rFonts w:ascii="Aptos Narrow" w:hAnsi="Aptos Narrow" w:cs="Times New Roman"/>
-                <w:kern w:val="0"/>
-              </w:rPr>
-              <w:t xml:space="preserve"> et al., 2022)</w:t>
+              <w:t>(Peipert et al., 2022)</w:t>
             </w:r>
             <w:r>
               <w:rPr>
@@ -19402,23 +19121,7 @@
                 <w:rFonts w:ascii="Aptos Narrow" w:hAnsi="Aptos Narrow" w:cs="Times New Roman"/>
                 <w:kern w:val="0"/>
               </w:rPr>
-              <w:t>(</w:t>
-            </w:r>
-            <w:proofErr w:type="spellStart"/>
-            <w:r>
-              <w:rPr>
-                <w:rFonts w:ascii="Aptos Narrow" w:hAnsi="Aptos Narrow" w:cs="Times New Roman"/>
-                <w:kern w:val="0"/>
-              </w:rPr>
-              <w:t>Ribotta</w:t>
-            </w:r>
-            <w:proofErr w:type="spellEnd"/>
-            <w:r>
-              <w:rPr>
-                <w:rFonts w:ascii="Aptos Narrow" w:hAnsi="Aptos Narrow" w:cs="Times New Roman"/>
-                <w:kern w:val="0"/>
-              </w:rPr>
-              <w:t xml:space="preserve"> et al., 2021)</w:t>
+              <w:t>(Ribotta et al., 2021)</w:t>
             </w:r>
             <w:r>
               <w:rPr>
@@ -19582,23 +19285,7 @@
                 <w:rFonts w:ascii="Aptos Narrow" w:hAnsi="Aptos Narrow" w:cs="Times New Roman"/>
                 <w:kern w:val="0"/>
               </w:rPr>
-              <w:t>(</w:t>
-            </w:r>
-            <w:proofErr w:type="spellStart"/>
-            <w:r>
-              <w:rPr>
-                <w:rFonts w:ascii="Aptos Narrow" w:hAnsi="Aptos Narrow" w:cs="Times New Roman"/>
-                <w:kern w:val="0"/>
-              </w:rPr>
-              <w:t>Skogestad</w:t>
-            </w:r>
-            <w:proofErr w:type="spellEnd"/>
-            <w:r>
-              <w:rPr>
-                <w:rFonts w:ascii="Aptos Narrow" w:hAnsi="Aptos Narrow" w:cs="Times New Roman"/>
-                <w:kern w:val="0"/>
-              </w:rPr>
-              <w:t xml:space="preserve"> et al., 2019)</w:t>
+              <w:t>(Skogestad et al., 2019)</w:t>
             </w:r>
             <w:r>
               <w:rPr>
@@ -20150,23 +19837,7 @@
                 <w:rFonts w:ascii="Aptos Narrow" w:hAnsi="Aptos Narrow" w:cs="Times New Roman"/>
                 <w:kern w:val="0"/>
               </w:rPr>
-              <w:t>(</w:t>
-            </w:r>
-            <w:proofErr w:type="spellStart"/>
-            <w:r>
-              <w:rPr>
-                <w:rFonts w:ascii="Aptos Narrow" w:hAnsi="Aptos Narrow" w:cs="Times New Roman"/>
-                <w:kern w:val="0"/>
-              </w:rPr>
-              <w:t>Karhulahti</w:t>
-            </w:r>
-            <w:proofErr w:type="spellEnd"/>
-            <w:r>
-              <w:rPr>
-                <w:rFonts w:ascii="Aptos Narrow" w:hAnsi="Aptos Narrow" w:cs="Times New Roman"/>
-                <w:kern w:val="0"/>
-              </w:rPr>
-              <w:t xml:space="preserve"> et al., 2023)</w:t>
+              <w:t>(Karhulahti et al., 2023)</w:t>
             </w:r>
             <w:r>
               <w:rPr>
@@ -20330,23 +20001,7 @@
                 <w:rFonts w:ascii="Aptos Narrow" w:hAnsi="Aptos Narrow" w:cs="Times New Roman"/>
                 <w:kern w:val="0"/>
               </w:rPr>
-              <w:t>(</w:t>
-            </w:r>
-            <w:proofErr w:type="spellStart"/>
-            <w:r>
-              <w:rPr>
-                <w:rFonts w:ascii="Aptos Narrow" w:hAnsi="Aptos Narrow" w:cs="Times New Roman"/>
-                <w:kern w:val="0"/>
-              </w:rPr>
-              <w:t>Bunaciu</w:t>
-            </w:r>
-            <w:proofErr w:type="spellEnd"/>
-            <w:r>
-              <w:rPr>
-                <w:rFonts w:ascii="Aptos Narrow" w:hAnsi="Aptos Narrow" w:cs="Times New Roman"/>
-                <w:kern w:val="0"/>
-              </w:rPr>
-              <w:t xml:space="preserve"> et al., 2024)</w:t>
+              <w:t>(Bunaciu et al., 2024)</w:t>
             </w:r>
             <w:r>
               <w:rPr>
@@ -21246,23 +20901,7 @@
                 <w:rFonts w:ascii="Aptos Narrow" w:hAnsi="Aptos Narrow" w:cs="Times New Roman"/>
                 <w:kern w:val="0"/>
               </w:rPr>
-              <w:t>(</w:t>
-            </w:r>
-            <w:proofErr w:type="spellStart"/>
-            <w:r>
-              <w:rPr>
-                <w:rFonts w:ascii="Aptos Narrow" w:hAnsi="Aptos Narrow" w:cs="Times New Roman"/>
-                <w:kern w:val="0"/>
-              </w:rPr>
-              <w:t>Koppold</w:t>
-            </w:r>
-            <w:proofErr w:type="spellEnd"/>
-            <w:r>
-              <w:rPr>
-                <w:rFonts w:ascii="Aptos Narrow" w:hAnsi="Aptos Narrow" w:cs="Times New Roman"/>
-                <w:kern w:val="0"/>
-              </w:rPr>
-              <w:t xml:space="preserve"> et al., 2023)</w:t>
+              <w:t>(Koppold et al., 2023)</w:t>
             </w:r>
             <w:r>
               <w:rPr>
@@ -22411,23 +22050,7 @@
                 <w:rFonts w:ascii="Aptos Narrow" w:hAnsi="Aptos Narrow" w:cs="Times New Roman"/>
                 <w:kern w:val="0"/>
               </w:rPr>
-              <w:t>(</w:t>
-            </w:r>
-            <w:proofErr w:type="spellStart"/>
-            <w:r>
-              <w:rPr>
-                <w:rFonts w:ascii="Aptos Narrow" w:hAnsi="Aptos Narrow" w:cs="Times New Roman"/>
-                <w:kern w:val="0"/>
-              </w:rPr>
-              <w:t>Deericks</w:t>
-            </w:r>
-            <w:proofErr w:type="spellEnd"/>
-            <w:r>
-              <w:rPr>
-                <w:rFonts w:ascii="Aptos Narrow" w:hAnsi="Aptos Narrow" w:cs="Times New Roman"/>
-                <w:kern w:val="0"/>
-              </w:rPr>
-              <w:t xml:space="preserve"> et al., 2025)</w:t>
+              <w:t>(Deericks et al., 2025)</w:t>
             </w:r>
             <w:r>
               <w:rPr>
@@ -22631,20 +22254,8 @@
                 <w:lang w:val="en-CH" w:eastAsia="en-CH"/>
                 <w14:ligatures w14:val="none"/>
               </w:rPr>
-              <w:t xml:space="preserve">obstructive sleep </w:t>
-            </w:r>
-            <w:proofErr w:type="spellStart"/>
-            <w:r>
-              <w:rPr>
-                <w:rFonts w:ascii="Aptos Narrow" w:eastAsia="Times New Roman" w:hAnsi="Aptos Narrow" w:cs="Times New Roman"/>
-                <w:color w:val="000000"/>
-                <w:kern w:val="0"/>
-                <w:lang w:val="en-CH" w:eastAsia="en-CH"/>
-                <w14:ligatures w14:val="none"/>
-              </w:rPr>
-              <w:t>apnea</w:t>
-            </w:r>
-            <w:proofErr w:type="spellEnd"/>
+              <w:t>obstructive sleep apnea</w:t>
+            </w:r>
           </w:p>
         </w:tc>
         <w:tc>
@@ -23936,15 +23547,7 @@
         <w:fldChar w:fldCharType="separate"/>
       </w:r>
       <w:r>
-        <w:t xml:space="preserve">Backhaus, S., </w:t>
-      </w:r>
-      <w:proofErr w:type="spellStart"/>
-      <w:r>
-        <w:t>Leijten</w:t>
-      </w:r>
-      <w:proofErr w:type="spellEnd"/>
-      <w:r>
-        <w:t xml:space="preserve">, P., Meinck, F., &amp; Gardner, F. (2022). Different Instruments, Same Content? A Systematic Comparison of Child Maltreatment and Harsh Parenting Instruments. </w:t>
+        <w:t xml:space="preserve">Backhaus, S., Leijten, P., Meinck, F., &amp; Gardner, F. (2022). Different Instruments, Same Content? A Systematic Comparison of Child Maltreatment and Harsh Parenting Instruments. </w:t>
       </w:r>
       <w:r>
         <w:rPr>
@@ -23962,23 +23565,7 @@
         <w:pStyle w:val="Bibliography"/>
       </w:pPr>
       <w:r>
-        <w:t xml:space="preserve">Bernardin, F., Gauld, C., Martin, V. P., </w:t>
-      </w:r>
-      <w:proofErr w:type="spellStart"/>
-      <w:r>
-        <w:t>Laprévote</w:t>
-      </w:r>
-      <w:proofErr w:type="spellEnd"/>
-      <w:r>
-        <w:t xml:space="preserve">, V., &amp; </w:t>
-      </w:r>
-      <w:proofErr w:type="spellStart"/>
-      <w:r>
-        <w:t>Dondé</w:t>
-      </w:r>
-      <w:proofErr w:type="spellEnd"/>
-      <w:r>
-        <w:t xml:space="preserve">, C. (2023). The 68 symptoms of the clinical high risk for psychosis: Low similarity among fourteen screening questionnaires. </w:t>
+        <w:t xml:space="preserve">Bernardin, F., Gauld, C., Martin, V. P., Laprévote, V., &amp; Dondé, C. (2023). The 68 symptoms of the clinical high risk for psychosis: Low similarity among fourteen screening questionnaires. </w:t>
       </w:r>
       <w:r>
         <w:rPr>
@@ -24051,21 +23638,8 @@
       <w:pPr>
         <w:pStyle w:val="Bibliography"/>
       </w:pPr>
-      <w:proofErr w:type="spellStart"/>
       <w:r>
-        <w:t>Bunaciu</w:t>
-      </w:r>
-      <w:proofErr w:type="spellEnd"/>
-      <w:r>
-        <w:t xml:space="preserve">, A., </w:t>
-      </w:r>
-      <w:proofErr w:type="spellStart"/>
-      <w:r>
-        <w:t>Bliuc</w:t>
-      </w:r>
-      <w:proofErr w:type="spellEnd"/>
-      <w:r>
-        <w:t xml:space="preserve">, A.-M., Best, D., Hennessy, E. A., Belanger, M. J., &amp; Benwell, C. S. Y. (2024). Measuring recovery capital for people recovering from alcohol and drug addiction: A systematic review. </w:t>
+        <w:t xml:space="preserve">Bunaciu, A., Bliuc, A.-M., Best, D., Hennessy, E. A., Belanger, M. J., &amp; Benwell, C. S. Y. (2024). Measuring recovery capital for people recovering from alcohol and drug addiction: A systematic review. </w:t>
       </w:r>
       <w:r>
         <w:rPr>
@@ -24093,15 +23667,7 @@
         <w:pStyle w:val="Bibliography"/>
       </w:pPr>
       <w:r>
-        <w:t xml:space="preserve">Castro, N., Hula, W. D., &amp; </w:t>
-      </w:r>
-      <w:proofErr w:type="spellStart"/>
-      <w:r>
-        <w:t>Ashaie</w:t>
-      </w:r>
-      <w:proofErr w:type="spellEnd"/>
-      <w:r>
-        <w:t xml:space="preserve">, S. A. (2023). Defining aphasia: Content analysis of six aphasia diagnostic batteries. </w:t>
+        <w:t xml:space="preserve">Castro, N., Hula, W. D., &amp; Ashaie, S. A. (2023). Defining aphasia: Content analysis of six aphasia diagnostic batteries. </w:t>
       </w:r>
       <w:r>
         <w:rPr>
@@ -24130,31 +23696,7 @@
       </w:pPr>
       <w:r>
         <w:lastRenderedPageBreak/>
-        <w:t xml:space="preserve">Charvet, C., </w:t>
-      </w:r>
-      <w:proofErr w:type="spellStart"/>
-      <w:r>
-        <w:t>Boutron</w:t>
-      </w:r>
-      <w:proofErr w:type="spellEnd"/>
-      <w:r>
-        <w:t xml:space="preserve">, I., Morvan, Y., Berre, C. L., </w:t>
-      </w:r>
-      <w:proofErr w:type="spellStart"/>
-      <w:r>
-        <w:t>Touboul</w:t>
-      </w:r>
-      <w:proofErr w:type="spellEnd"/>
-      <w:r>
-        <w:t xml:space="preserve">, S., Gaillard, R., Fried, E., &amp; </w:t>
-      </w:r>
-      <w:proofErr w:type="spellStart"/>
-      <w:r>
-        <w:t>Chevance</w:t>
-      </w:r>
-      <w:proofErr w:type="spellEnd"/>
-      <w:r>
-        <w:t xml:space="preserve">, A. (2022). How to measure mental pain: A systematic review assessing measures of mental pain. </w:t>
+        <w:t xml:space="preserve">Charvet, C., Boutron, I., Morvan, Y., Berre, C. L., Touboul, S., Gaillard, R., Fried, E., &amp; Chevance, A. (2022). How to measure mental pain: A systematic review assessing measures of mental pain. </w:t>
       </w:r>
       <w:r>
         <w:rPr>
@@ -24200,15 +23742,7 @@
         <w:pStyle w:val="Bibliography"/>
       </w:pPr>
       <w:r>
-        <w:t xml:space="preserve">Chrobak, A. A., Krupa, A., Dudek, D., &amp; Siwek, M. (2021). How soft are neurological soft signs? Content overlap analysis of 71 symptoms among seven </w:t>
-      </w:r>
-      <w:proofErr w:type="gramStart"/>
-      <w:r>
-        <w:t>most commonly used</w:t>
-      </w:r>
-      <w:proofErr w:type="gramEnd"/>
-      <w:r>
-        <w:t xml:space="preserve"> neurological soft signs scales. </w:t>
+        <w:t xml:space="preserve">Chrobak, A. A., Krupa, A., Dudek, D., &amp; Siwek, M. (2021). How soft are neurological soft signs? Content overlap analysis of 71 symptoms among seven most commonly used neurological soft signs scales. </w:t>
       </w:r>
       <w:r>
         <w:rPr>
@@ -24236,31 +23770,7 @@
         <w:pStyle w:val="Bibliography"/>
       </w:pPr>
       <w:r>
-        <w:t>Chrobak, A. A., Rusinek, J., Dec-</w:t>
-      </w:r>
-      <w:proofErr w:type="spellStart"/>
-      <w:r>
-        <w:t>Ćwiek</w:t>
-      </w:r>
-      <w:proofErr w:type="spellEnd"/>
-      <w:r>
-        <w:t xml:space="preserve">, M., </w:t>
-      </w:r>
-      <w:proofErr w:type="spellStart"/>
-      <w:r>
-        <w:t>Porębska</w:t>
-      </w:r>
-      <w:proofErr w:type="spellEnd"/>
-      <w:r>
-        <w:t xml:space="preserve">, K., &amp; Siwek, M. (2024). Content overlap of 91 dystonia symptoms among the seven </w:t>
-      </w:r>
-      <w:proofErr w:type="gramStart"/>
-      <w:r>
-        <w:t>most commonly used</w:t>
-      </w:r>
-      <w:proofErr w:type="gramEnd"/>
-      <w:r>
-        <w:t xml:space="preserve"> cervical dystonia scales. </w:t>
+        <w:t xml:space="preserve">Chrobak, A. A., Rusinek, J., Dec-Ćwiek, M., Porębska, K., &amp; Siwek, M. (2024). Content overlap of 91 dystonia symptoms among the seven most commonly used cervical dystonia scales. </w:t>
       </w:r>
       <w:r>
         <w:rPr>
@@ -24288,15 +23798,7 @@
         <w:pStyle w:val="Bibliography"/>
       </w:pPr>
       <w:r>
-        <w:t xml:space="preserve">Chrobak, A. A., Siwek, M., Dudek, D., &amp; </w:t>
-      </w:r>
-      <w:proofErr w:type="spellStart"/>
-      <w:r>
-        <w:t>Rybakowski</w:t>
-      </w:r>
-      <w:proofErr w:type="spellEnd"/>
-      <w:r>
-        <w:t xml:space="preserve">, J. K. (2018). Content overlap analysis of 64 (hypo)mania symptoms among seven common rating scales. </w:t>
+        <w:t xml:space="preserve">Chrobak, A. A., Siwek, M., Dudek, D., &amp; Rybakowski, J. K. (2018). Content overlap analysis of 64 (hypo)mania symptoms among seven common rating scales. </w:t>
       </w:r>
       <w:r>
         <w:rPr>
@@ -24351,21 +23853,8 @@
       <w:pPr>
         <w:pStyle w:val="Bibliography"/>
       </w:pPr>
-      <w:proofErr w:type="spellStart"/>
       <w:r>
-        <w:t>Deericks</w:t>
-      </w:r>
-      <w:proofErr w:type="spellEnd"/>
-      <w:r>
-        <w:t xml:space="preserve">, H. A., McClellan, M. B., </w:t>
-      </w:r>
-      <w:proofErr w:type="spellStart"/>
-      <w:r>
-        <w:t>Sabgir</w:t>
-      </w:r>
-      <w:proofErr w:type="spellEnd"/>
-      <w:r>
-        <w:t xml:space="preserve">, C., Youngstrom, E. A., &amp; Baggs, J. J. (2025). 5.68 Trauma Measures Are Not Interchangeable: Item Content Analysis of Scales Used to Screen or Assess Trauma and PTSD. </w:t>
+        <w:t xml:space="preserve">Deericks, H. A., McClellan, M. B., Sabgir, C., Youngstrom, E. A., &amp; Baggs, J. J. (2025). 5.68 Trauma Measures Are Not Interchangeable: Item Content Analysis of Scales Used to Screen or Assess Trauma and PTSD. </w:t>
       </w:r>
       <w:r>
         <w:rPr>
@@ -24401,17 +23890,8 @@
           <w:i/>
           <w:iCs/>
         </w:rPr>
-        <w:t xml:space="preserve">European Journal of </w:t>
+        <w:t>European Journal of Psychotraumatology</w:t>
       </w:r>
-      <w:proofErr w:type="spellStart"/>
-      <w:r>
-        <w:rPr>
-          <w:i/>
-          <w:iCs/>
-        </w:rPr>
-        <w:t>Psychotraumatology</w:t>
-      </w:r>
-      <w:proofErr w:type="spellEnd"/>
       <w:r>
         <w:t xml:space="preserve">, </w:t>
       </w:r>
@@ -24477,15 +23957,7 @@
         <w:pStyle w:val="Bibliography"/>
       </w:pPr>
       <w:r>
-        <w:t xml:space="preserve">Gauld, C., </w:t>
-      </w:r>
-      <w:proofErr w:type="spellStart"/>
-      <w:r>
-        <w:t>Baillieul</w:t>
-      </w:r>
-      <w:proofErr w:type="spellEnd"/>
-      <w:r>
-        <w:t xml:space="preserve">, S., Martin, V. P., Richaud, A., Lopez, R., Pelou, M., Abi-Saab, P., Coelho, J., Philip, P., Pépin, J. L., &amp; Micoulaud-Franchi, J.-A. (2024). Symptom content analysis of OSA questionnaires: Time to identify and improve relevance of diversity of OSA symptoms? </w:t>
+        <w:t xml:space="preserve">Gauld, C., Baillieul, S., Martin, V. P., Richaud, A., Lopez, R., Pelou, M., Abi-Saab, P., Coelho, J., Philip, P., Pépin, J. L., &amp; Micoulaud-Franchi, J.-A. (2024). Symptom content analysis of OSA questionnaires: Time to identify and improve relevance of diversity of OSA symptoms? </w:t>
       </w:r>
       <w:r>
         <w:rPr>
@@ -24513,31 +23985,7 @@
         <w:pStyle w:val="Bibliography"/>
       </w:pPr>
       <w:r>
-        <w:t xml:space="preserve">Gauld, C., Martin, V. P., Richaud, A., </w:t>
-      </w:r>
-      <w:proofErr w:type="spellStart"/>
-      <w:r>
-        <w:t>Baillieul</w:t>
-      </w:r>
-      <w:proofErr w:type="spellEnd"/>
-      <w:r>
-        <w:t xml:space="preserve">, S., Vicente, L., </w:t>
-      </w:r>
-      <w:proofErr w:type="spellStart"/>
-      <w:r>
-        <w:t>Perromat</w:t>
-      </w:r>
-      <w:proofErr w:type="spellEnd"/>
-      <w:r>
-        <w:t xml:space="preserve">, J.-L., Zreik, I., </w:t>
-      </w:r>
-      <w:proofErr w:type="spellStart"/>
-      <w:r>
-        <w:t>Taillard</w:t>
-      </w:r>
-      <w:proofErr w:type="spellEnd"/>
-      <w:r>
-        <w:t xml:space="preserve">, J., Geoffroy, P. A., Lopez, R., &amp; Micoulaud-Franchi, J.-A. (2023). Systematic Item Content and Overlap Analysis of Self-Reported Multiple Sleep Disorder Screening Questionnaires in Adults. </w:t>
+        <w:t xml:space="preserve">Gauld, C., Martin, V. P., Richaud, A., Baillieul, S., Vicente, L., Perromat, J.-L., Zreik, I., Taillard, J., Geoffroy, P. A., Lopez, R., &amp; Micoulaud-Franchi, J.-A. (2023). Systematic Item Content and Overlap Analysis of Self-Reported Multiple Sleep Disorder Screening Questionnaires in Adults. </w:t>
       </w:r>
       <w:r>
         <w:rPr>
@@ -24565,15 +24013,7 @@
         <w:pStyle w:val="Bibliography"/>
       </w:pPr>
       <w:r>
-        <w:t xml:space="preserve">Hendriks, A. M., Ip, H. F., Nivard, M. G., Finkenauer, C., Van Beijsterveldt, C. E. M., Bartels, M., &amp; Boomsma, D. I. (2020). Content, diagnostic, correlational, and genetic similarities between common measures of childhood aggressive </w:t>
-      </w:r>
-      <w:proofErr w:type="spellStart"/>
-      <w:r>
-        <w:t>behaviors</w:t>
-      </w:r>
-      <w:proofErr w:type="spellEnd"/>
-      <w:r>
-        <w:t xml:space="preserve"> and related psychiatric traits. </w:t>
+        <w:t xml:space="preserve">Hendriks, A. M., Ip, H. F., Nivard, M. G., Finkenauer, C., Van Beijsterveldt, C. E. M., Bartels, M., &amp; Boomsma, D. I. (2020). Content, diagnostic, correlational, and genetic similarities between common measures of childhood aggressive behaviors and related psychiatric traits. </w:t>
       </w:r>
       <w:r>
         <w:rPr>
@@ -24600,30 +24040,9 @@
       <w:pPr>
         <w:pStyle w:val="Bibliography"/>
       </w:pPr>
-      <w:proofErr w:type="spellStart"/>
       <w:r>
         <w:lastRenderedPageBreak/>
-        <w:t>Karhulahti</w:t>
-      </w:r>
-      <w:proofErr w:type="spellEnd"/>
-      <w:r>
-        <w:t xml:space="preserve">, V.-M., </w:t>
-      </w:r>
-      <w:proofErr w:type="spellStart"/>
-      <w:r>
-        <w:t>Martončik</w:t>
-      </w:r>
-      <w:proofErr w:type="spellEnd"/>
-      <w:r>
-        <w:t xml:space="preserve">, M., &amp; </w:t>
-      </w:r>
-      <w:proofErr w:type="spellStart"/>
-      <w:r>
-        <w:t>Adamkovič</w:t>
-      </w:r>
-      <w:proofErr w:type="spellEnd"/>
-      <w:r>
-        <w:t xml:space="preserve">, M. (2023). Measuring Internet Gaming Disorder and Gaming Disorder: A Qualitative Content Validity Analysis of Validated Scales. </w:t>
+        <w:t xml:space="preserve">Karhulahti, V.-M., Martončik, M., &amp; Adamkovič, M. (2023). Measuring Internet Gaming Disorder and Gaming Disorder: A Qualitative Content Validity Analysis of Validated Scales. </w:t>
       </w:r>
       <w:r>
         <w:rPr>
@@ -24706,13 +24125,8 @@
       <w:pPr>
         <w:pStyle w:val="Bibliography"/>
       </w:pPr>
-      <w:proofErr w:type="spellStart"/>
       <w:r>
-        <w:t>Koppold</w:t>
-      </w:r>
-      <w:proofErr w:type="spellEnd"/>
-      <w:r>
-        <w:t xml:space="preserve">, A., Ruge, J., Hecker, T., &amp; Lonsdorf, T. B. (2023, May). </w:t>
+        <w:t xml:space="preserve">Koppold, A., Ruge, J., Hecker, T., &amp; Lonsdorf, T. B. (2023, May). </w:t>
       </w:r>
       <w:r>
         <w:rPr>
@@ -24722,15 +24136,7 @@
         <w:t>The many faces of early life adversity—Content overlap in validated assessment instruments as well as in fear and reward learning research</w:t>
       </w:r>
       <w:r>
-        <w:t xml:space="preserve">. </w:t>
-      </w:r>
-      <w:proofErr w:type="spellStart"/>
-      <w:r>
-        <w:t>Zenodo</w:t>
-      </w:r>
-      <w:proofErr w:type="spellEnd"/>
-      <w:r>
-        <w:t>. https://doi.org/10.5281/ZENODO.7966818</w:t>
+        <w:t>. Zenodo. https://doi.org/10.5281/ZENODO.7966818</w:t>
       </w:r>
     </w:p>
     <w:p>
@@ -24738,15 +24144,7 @@
         <w:pStyle w:val="Bibliography"/>
       </w:pPr>
       <w:r>
-        <w:t xml:space="preserve">Lampe, E. W., Schaumberg, K., Kolar, D., Coniglio, K., Cooper, M., Chapa, D. A. N., &amp; Gorrell, S. (2024). Working out measurement </w:t>
-      </w:r>
-      <w:proofErr w:type="gramStart"/>
-      <w:r>
-        <w:t>overlap</w:t>
-      </w:r>
-      <w:proofErr w:type="gramEnd"/>
-      <w:r>
-        <w:t xml:space="preserve"> in the assessment of maladaptive exercise. </w:t>
+        <w:t xml:space="preserve">Lampe, E. W., Schaumberg, K., Kolar, D., Coniglio, K., Cooper, M., Chapa, D. A. N., &amp; Gorrell, S. (2024). Working out measurement overlap in the assessment of maladaptive exercise. </w:t>
       </w:r>
       <w:r>
         <w:rPr>
@@ -24792,15 +24190,7 @@
         <w:pStyle w:val="Bibliography"/>
       </w:pPr>
       <w:r>
-        <w:t xml:space="preserve">Lindert, J., Behr, K.-J., Arndt, S., </w:t>
-      </w:r>
-      <w:proofErr w:type="spellStart"/>
-      <w:r>
-        <w:t>Jakubauskiene</w:t>
-      </w:r>
-      <w:proofErr w:type="spellEnd"/>
-      <w:r>
-        <w:t xml:space="preserve">, M., Bain, P. A., Milin, S., Schuh, L. M., &amp; Schäfer, I. (2025). Measuring Substance Use in Refugees: A Systematic Review of Assessment Instruments. </w:t>
+        <w:t xml:space="preserve">Lindert, J., Behr, K.-J., Arndt, S., Jakubauskiene, M., Bain, P. A., Milin, S., Schuh, L. M., &amp; Schäfer, I. (2025). Measuring Substance Use in Refugees: A Systematic Review of Assessment Instruments. </w:t>
       </w:r>
       <w:r>
         <w:rPr>
@@ -24847,15 +24237,7 @@
       </w:pPr>
       <w:r>
         <w:lastRenderedPageBreak/>
-        <w:t xml:space="preserve">Martin, C., Jones, C., Marshall, C. A., Huang, C., Reeve, J., Fleming, M. P., König, J., &amp; </w:t>
-      </w:r>
-      <w:proofErr w:type="spellStart"/>
-      <w:r>
-        <w:t>Jomeen</w:t>
-      </w:r>
-      <w:proofErr w:type="spellEnd"/>
-      <w:r>
-        <w:t xml:space="preserve">, J. (2022). Fear of childbirth measurement: Appraisal of the content overlap of four instruments. </w:t>
+        <w:t xml:space="preserve">Martin, C., Jones, C., Marshall, C. A., Huang, C., Reeve, J., Fleming, M. P., König, J., &amp; Jomeen, J. (2022). Fear of childbirth measurement: Appraisal of the content overlap of four instruments. </w:t>
       </w:r>
       <w:r>
         <w:rPr>
@@ -24936,71 +24318,18 @@
           <w:i/>
           <w:iCs/>
         </w:rPr>
-        <w:t xml:space="preserve">Heterogeneity in item content of </w:t>
-      </w:r>
-      <w:proofErr w:type="gramStart"/>
-      <w:r>
-        <w:rPr>
-          <w:i/>
-          <w:iCs/>
-        </w:rPr>
-        <w:t>quality of life</w:t>
-      </w:r>
-      <w:proofErr w:type="gramEnd"/>
-      <w:r>
-        <w:rPr>
-          <w:i/>
-          <w:iCs/>
-        </w:rPr>
-        <w:t xml:space="preserve"> assessments used in depression research</w:t>
+        <w:t>Heterogeneity in item content of quality of life assessments used in depression research</w:t>
       </w:r>
       <w:r>
-        <w:t xml:space="preserve"> [Preprint]. </w:t>
-      </w:r>
-      <w:proofErr w:type="spellStart"/>
-      <w:r>
-        <w:t>PsyArXiv</w:t>
-      </w:r>
-      <w:proofErr w:type="spellEnd"/>
-      <w:r>
-        <w:t>. https://doi.org/10.31234/osf.io/3s6y8</w:t>
+        <w:t xml:space="preserve"> [Preprint]. PsyArXiv. https://doi.org/10.31234/osf.io/3s6y8</w:t>
       </w:r>
     </w:p>
     <w:p>
       <w:pPr>
         <w:pStyle w:val="Bibliography"/>
       </w:pPr>
-      <w:proofErr w:type="spellStart"/>
       <w:r>
-        <w:t>Ribotta</w:t>
-      </w:r>
-      <w:proofErr w:type="spellEnd"/>
-      <w:r>
-        <w:t xml:space="preserve">, B., Silan, M. A., </w:t>
-      </w:r>
-      <w:proofErr w:type="spellStart"/>
-      <w:r>
-        <w:t>Dujols</w:t>
-      </w:r>
-      <w:proofErr w:type="spellEnd"/>
-      <w:r>
-        <w:t xml:space="preserve">, O., </w:t>
-      </w:r>
-      <w:proofErr w:type="spellStart"/>
-      <w:r>
-        <w:t>Bellemin</w:t>
-      </w:r>
-      <w:proofErr w:type="spellEnd"/>
-      <w:r>
-        <w:t xml:space="preserve">, R., &amp; </w:t>
-      </w:r>
-      <w:proofErr w:type="spellStart"/>
-      <w:r>
-        <w:t>IJzerman</w:t>
-      </w:r>
-      <w:proofErr w:type="spellEnd"/>
-      <w:r>
-        <w:t xml:space="preserve">, H. (2021, December). </w:t>
+        <w:t xml:space="preserve">Ribotta, B., Silan, M. A., Dujols, O., Bellemin, R., &amp; IJzerman, H. (2021, December). </w:t>
       </w:r>
       <w:r>
         <w:rPr>
@@ -25010,36 +24339,15 @@
         <w:t>Lack of Construct Validity and Item-Content Overlap in the Assessment of Romantic Relationship Quality</w:t>
       </w:r>
       <w:r>
-        <w:t xml:space="preserve">. </w:t>
-      </w:r>
-      <w:proofErr w:type="spellStart"/>
-      <w:r>
-        <w:t>PsyArXiv</w:t>
-      </w:r>
-      <w:proofErr w:type="spellEnd"/>
-      <w:r>
-        <w:t>. https://doi.org/10.31234/osf.io/w32dc</w:t>
+        <w:t>. PsyArXiv. https://doi.org/10.31234/osf.io/w32dc</w:t>
       </w:r>
     </w:p>
     <w:p>
       <w:pPr>
         <w:pStyle w:val="Bibliography"/>
       </w:pPr>
-      <w:proofErr w:type="spellStart"/>
       <w:r>
-        <w:t>Skogestad</w:t>
-      </w:r>
-      <w:proofErr w:type="spellEnd"/>
-      <w:r>
-        <w:t xml:space="preserve">, I. J., Kirkevold, M., </w:t>
-      </w:r>
-      <w:proofErr w:type="spellStart"/>
-      <w:r>
-        <w:t>Indredavik</w:t>
-      </w:r>
-      <w:proofErr w:type="spellEnd"/>
-      <w:r>
-        <w:t xml:space="preserve">, B., Gay, C. L., &amp; Lerdal, A. (2019). Lack of content overlap and essential dimensions – A review of measures used for post-stroke fatigue. </w:t>
+        <w:t xml:space="preserve">Skogestad, I. J., Kirkevold, M., Indredavik, B., Gay, C. L., &amp; Lerdal, A. (2019). Lack of content overlap and essential dimensions – A review of measures used for post-stroke fatigue. </w:t>
       </w:r>
       <w:r>
         <w:rPr>
@@ -25067,15 +24375,7 @@
         <w:pStyle w:val="Bibliography"/>
       </w:pPr>
       <w:r>
-        <w:t xml:space="preserve">Ten Klooster, P. M., Simoes, J. P., &amp; </w:t>
-      </w:r>
-      <w:proofErr w:type="spellStart"/>
-      <w:r>
-        <w:t>Vonkeman</w:t>
-      </w:r>
-      <w:proofErr w:type="spellEnd"/>
-      <w:r>
-        <w:t xml:space="preserve">, H. E. (2024). Limited content overlap between commonly used self-report instruments for central (pain) sensitization in rheumatology. </w:t>
+        <w:t xml:space="preserve">Ten Klooster, P. M., Simoes, J. P., &amp; Vonkeman, H. E. (2024). Limited content overlap between commonly used self-report instruments for central (pain) sensitization in rheumatology. </w:t>
       </w:r>
       <w:r>
         <w:rPr>
@@ -25103,15 +24403,7 @@
         <w:pStyle w:val="Bibliography"/>
       </w:pPr>
       <w:r>
-        <w:t xml:space="preserve">Vial, A., Assink, M., </w:t>
-      </w:r>
-      <w:proofErr w:type="spellStart"/>
-      <w:r>
-        <w:t>Stams</w:t>
-      </w:r>
-      <w:proofErr w:type="spellEnd"/>
-      <w:r>
-        <w:t xml:space="preserve">, G. J. J. M., &amp; Van Der Put, C. (2020). Safety assessment in child welfare: A comparison of instruments. </w:t>
+        <w:t xml:space="preserve">Vial, A., Assink, M., Stams, G. J. J. M., &amp; Van Der Put, C. (2020). Safety assessment in child welfare: A comparison of instruments. </w:t>
       </w:r>
       <w:r>
         <w:rPr>
@@ -25193,23 +24485,7 @@
           <w:i/>
           <w:iCs/>
         </w:rPr>
-        <w:t xml:space="preserve">Journal of Psychopathology and </w:t>
-      </w:r>
-      <w:proofErr w:type="spellStart"/>
-      <w:r>
-        <w:rPr>
-          <w:i/>
-          <w:iCs/>
-        </w:rPr>
-        <w:t>Behavioral</w:t>
-      </w:r>
-      <w:proofErr w:type="spellEnd"/>
-      <w:r>
-        <w:rPr>
-          <w:i/>
-          <w:iCs/>
-        </w:rPr>
-        <w:t xml:space="preserve"> Assessment</w:t>
+        <w:t>Journal of Psychopathology and Behavioral Assessment</w:t>
       </w:r>
       <w:r>
         <w:t xml:space="preserve">, </w:t>

</xml_diff>